<commit_message>
dynamic number of semesters
</commit_message>
<xml_diff>
--- a/templates/docxRPD/passport.docx
+++ b/templates/docxRPD/passport.docx
@@ -294,15 +294,23 @@
           <w:sz w:val="24"/>
           <w:szCs w:val="24"/>
         </w:rPr>
-        <w:t xml:space="preserve">{{ </w:t>
-      </w:r>
-      <w:proofErr w:type="spellStart"/>
+        <w:t>{{ direction</w:t>
+      </w:r>
+      <w:proofErr w:type="gramEnd"/>
       <w:r>
         <w:rPr>
           <w:sz w:val="24"/>
           <w:szCs w:val="24"/>
         </w:rPr>
-        <w:t>direction</w:t>
+        <w:t>_</w:t>
+      </w:r>
+      <w:proofErr w:type="gramStart"/>
+      <w:r>
+        <w:rPr>
+          <w:sz w:val="24"/>
+          <w:szCs w:val="24"/>
+        </w:rPr>
+        <w:t>code }</w:t>
       </w:r>
       <w:proofErr w:type="gramEnd"/>
       <w:r>
@@ -310,7 +318,7 @@
           <w:sz w:val="24"/>
           <w:szCs w:val="24"/>
         </w:rPr>
-        <w:t>_</w:t>
+        <w:t xml:space="preserve">} </w:t>
       </w:r>
       <w:proofErr w:type="gramStart"/>
       <w:r>
@@ -318,41 +326,8 @@
           <w:sz w:val="24"/>
           <w:szCs w:val="24"/>
         </w:rPr>
-        <w:t>code</w:t>
-      </w:r>
-      <w:proofErr w:type="spellEnd"/>
-      <w:r>
-        <w:rPr>
-          <w:sz w:val="24"/>
-          <w:szCs w:val="24"/>
-        </w:rPr>
-        <w:t xml:space="preserve"> }</w:t>
-      </w:r>
-      <w:proofErr w:type="gramEnd"/>
-      <w:r>
-        <w:rPr>
-          <w:sz w:val="24"/>
-          <w:szCs w:val="24"/>
-        </w:rPr>
-        <w:t xml:space="preserve">} </w:t>
-      </w:r>
-      <w:proofErr w:type="gramStart"/>
-      <w:r>
-        <w:rPr>
-          <w:sz w:val="24"/>
-          <w:szCs w:val="24"/>
-        </w:rPr>
-        <w:t xml:space="preserve">{{ </w:t>
-      </w:r>
-      <w:proofErr w:type="spellStart"/>
-      <w:r>
-        <w:rPr>
-          <w:sz w:val="24"/>
-          <w:szCs w:val="24"/>
-        </w:rPr>
-        <w:t>direction</w:t>
-      </w:r>
-      <w:proofErr w:type="spellEnd"/>
+        <w:t>{{ direction</w:t>
+      </w:r>
       <w:proofErr w:type="gramEnd"/>
       <w:r>
         <w:rPr>
@@ -738,17 +713,8 @@
           <w:spacing w:val="-2"/>
           <w:sz w:val="24"/>
         </w:rPr>
-        <w:t xml:space="preserve">{{ </w:t>
-      </w:r>
-      <w:proofErr w:type="spellStart"/>
-      <w:r>
-        <w:rPr>
-          <w:spacing w:val="-2"/>
-          <w:sz w:val="24"/>
-        </w:rPr>
-        <w:t>kvalif</w:t>
-      </w:r>
-      <w:proofErr w:type="spellEnd"/>
+        <w:t>{{ kvalif</w:t>
+      </w:r>
       <w:proofErr w:type="gramEnd"/>
       <w:r>
         <w:rPr>
@@ -1055,39 +1021,23 @@
           <w:spacing w:val="-4"/>
           <w:sz w:val="24"/>
         </w:rPr>
-        <w:t xml:space="preserve">{{ </w:t>
-      </w:r>
-      <w:proofErr w:type="spellStart"/>
+        <w:t>{{ year</w:t>
+      </w:r>
+      <w:proofErr w:type="gramEnd"/>
       <w:r>
         <w:rPr>
           <w:spacing w:val="-4"/>
           <w:sz w:val="24"/>
         </w:rPr>
-        <w:t>year</w:t>
-      </w:r>
-      <w:proofErr w:type="gramEnd"/>
+        <w:t>_</w:t>
+      </w:r>
+      <w:proofErr w:type="gramStart"/>
       <w:r>
         <w:rPr>
           <w:spacing w:val="-4"/>
           <w:sz w:val="24"/>
         </w:rPr>
-        <w:t>_</w:t>
-      </w:r>
-      <w:proofErr w:type="gramStart"/>
-      <w:r>
-        <w:rPr>
-          <w:spacing w:val="-4"/>
-          <w:sz w:val="24"/>
-        </w:rPr>
-        <w:t>post</w:t>
-      </w:r>
-      <w:proofErr w:type="spellEnd"/>
-      <w:r>
-        <w:rPr>
-          <w:spacing w:val="-4"/>
-          <w:sz w:val="24"/>
-        </w:rPr>
-        <w:t xml:space="preserve"> }</w:t>
+        <w:t>post }</w:t>
       </w:r>
       <w:proofErr w:type="gramEnd"/>
       <w:r>
@@ -1158,11 +1108,7 @@
       </w:r>
       <w:proofErr w:type="gramStart"/>
       <w:r>
-        <w:t xml:space="preserve">{{ </w:t>
-      </w:r>
-      <w:proofErr w:type="spellStart"/>
-      <w:r>
-        <w:t>protocol</w:t>
+        <w:t>{{ protocol</w:t>
       </w:r>
       <w:proofErr w:type="gramEnd"/>
       <w:r>
@@ -1170,11 +1116,7 @@
       </w:r>
       <w:proofErr w:type="gramStart"/>
       <w:r>
-        <w:t>year</w:t>
-      </w:r>
-      <w:proofErr w:type="spellEnd"/>
-      <w:r>
-        <w:t xml:space="preserve"> }</w:t>
+        <w:t>year }</w:t>
       </w:r>
       <w:proofErr w:type="gramEnd"/>
       <w:r>
@@ -1228,15 +1170,51 @@
         <w:pStyle w:val="a3"/>
         <w:spacing w:before="73"/>
         <w:ind w:right="343"/>
+        <w:rPr>
+          <w:lang w:val="en-US"/>
+        </w:rPr>
       </w:pPr>
       <w:proofErr w:type="gramStart"/>
       <w:r>
         <w:rPr>
           <w:lang w:val="en-US"/>
         </w:rPr>
+        <w:t>{{ item</w:t>
+      </w:r>
+      <w:proofErr w:type="gramEnd"/>
+      <w:r>
+        <w:rPr>
+          <w:lang w:val="en-US"/>
+        </w:rPr>
+        <w:t>.competence_</w:t>
+      </w:r>
+      <w:proofErr w:type="gramStart"/>
+      <w:r>
+        <w:rPr>
+          <w:lang w:val="en-US"/>
+        </w:rPr>
+        <w:t>index }</w:t>
+      </w:r>
+      <w:proofErr w:type="gramEnd"/>
+      <w:r>
+        <w:rPr>
+          <w:lang w:val="en-US"/>
+        </w:rPr>
+        <w:t>}</w:t>
+      </w:r>
+      <w:r>
+        <w:rPr>
+          <w:lang w:val="en-US"/>
+        </w:rPr>
+        <w:t xml:space="preserve">. </w:t>
+      </w:r>
+      <w:proofErr w:type="gramStart"/>
+      <w:r>
+        <w:rPr>
+          <w:lang w:val="en-US"/>
+        </w:rPr>
         <w:t xml:space="preserve">{{ </w:t>
       </w:r>
-      <w:proofErr w:type="spellStart"/>
       <w:r>
         <w:rPr>
           <w:lang w:val="en-US"/>
@@ -1248,16 +1226,15 @@
         <w:rPr>
           <w:lang w:val="en-US"/>
         </w:rPr>
-        <w:t>.competence_</w:t>
+        <w:t>.</w:t>
       </w:r>
       <w:proofErr w:type="gramStart"/>
       <w:r>
         <w:rPr>
           <w:lang w:val="en-US"/>
         </w:rPr>
-        <w:t>index</w:t>
-      </w:r>
-      <w:proofErr w:type="spellEnd"/>
+        <w:t>competence</w:t>
+      </w:r>
       <w:r>
         <w:rPr>
           <w:lang w:val="en-US"/>
@@ -1269,40 +1246,6 @@
         <w:rPr>
           <w:lang w:val="en-US"/>
         </w:rPr>
-        <w:t>}</w:t>
-      </w:r>
-      <w:r>
-        <w:rPr>
-          <w:lang w:val="en-US"/>
-        </w:rPr>
-        <w:t xml:space="preserve">. </w:t>
-      </w:r>
-      <w:proofErr w:type="gramStart"/>
-      <w:r>
-        <w:t xml:space="preserve">{{ </w:t>
-      </w:r>
-      <w:r>
-        <w:rPr>
-          <w:lang w:val="en-US"/>
-        </w:rPr>
-        <w:t>item</w:t>
-      </w:r>
-      <w:proofErr w:type="gramEnd"/>
-      <w:r>
-        <w:t>.</w:t>
-      </w:r>
-      <w:proofErr w:type="gramStart"/>
-      <w:r>
-        <w:rPr>
-          <w:lang w:val="en-US"/>
-        </w:rPr>
-        <w:t>competence</w:t>
-      </w:r>
-      <w:r>
-        <w:t xml:space="preserve"> }</w:t>
-      </w:r>
-      <w:proofErr w:type="gramEnd"/>
-      <w:r>
         <w:t>}</w:t>
       </w:r>
     </w:p>
@@ -1312,6 +1255,7 @@
         <w:rPr>
           <w:b/>
           <w:sz w:val="24"/>
+          <w:lang w:val="en-US"/>
         </w:rPr>
       </w:pPr>
     </w:p>
@@ -1461,39 +1405,23 @@
           <w:spacing w:val="-2"/>
           <w:sz w:val="24"/>
         </w:rPr>
-        <w:t xml:space="preserve">{{ </w:t>
-      </w:r>
-      <w:proofErr w:type="spellStart"/>
+        <w:t>{{ item</w:t>
+      </w:r>
+      <w:proofErr w:type="gramEnd"/>
       <w:r>
         <w:rPr>
           <w:spacing w:val="-2"/>
           <w:sz w:val="24"/>
         </w:rPr>
-        <w:t>item</w:t>
-      </w:r>
-      <w:proofErr w:type="gramEnd"/>
+        <w:t>.competence_</w:t>
+      </w:r>
+      <w:proofErr w:type="gramStart"/>
       <w:r>
         <w:rPr>
           <w:spacing w:val="-2"/>
           <w:sz w:val="24"/>
         </w:rPr>
-        <w:t>.competence_</w:t>
-      </w:r>
-      <w:proofErr w:type="gramStart"/>
-      <w:r>
-        <w:rPr>
-          <w:spacing w:val="-2"/>
-          <w:sz w:val="24"/>
-        </w:rPr>
-        <w:t>relations</w:t>
-      </w:r>
-      <w:proofErr w:type="spellEnd"/>
-      <w:r>
-        <w:rPr>
-          <w:spacing w:val="-2"/>
-          <w:sz w:val="24"/>
-        </w:rPr>
-        <w:t xml:space="preserve"> }</w:t>
+        <w:t>relations }</w:t>
       </w:r>
       <w:proofErr w:type="gramEnd"/>
       <w:r>
@@ -1612,23 +1540,17 @@
       <w:tblGrid>
         <w:gridCol w:w="1714"/>
         <w:gridCol w:w="2705"/>
-        <w:gridCol w:w="566"/>
-        <w:gridCol w:w="528"/>
-        <w:gridCol w:w="567"/>
-        <w:gridCol w:w="566"/>
-        <w:gridCol w:w="708"/>
-        <w:gridCol w:w="711"/>
-        <w:gridCol w:w="708"/>
-        <w:gridCol w:w="600"/>
+        <w:gridCol w:w="511"/>
+        <w:gridCol w:w="583"/>
+        <w:gridCol w:w="551"/>
       </w:tblGrid>
       <w:tr>
         <w:trPr>
-          <w:trHeight w:val="227"/>
+          <w:trHeight w:val="467"/>
         </w:trPr>
         <w:tc>
           <w:tcPr>
             <w:tcW w:w="1714" w:type="dxa"/>
-            <w:vMerge w:val="restart"/>
             <w:shd w:val="clear" w:color="auto" w:fill="FFFFFF" w:themeFill="background1"/>
           </w:tcPr>
           <w:p>
@@ -1669,7 +1591,6 @@
         <w:tc>
           <w:tcPr>
             <w:tcW w:w="2705" w:type="dxa"/>
-            <w:vMerge w:val="restart"/>
             <w:shd w:val="clear" w:color="auto" w:fill="FFFFFF" w:themeFill="background1"/>
           </w:tcPr>
           <w:p>
@@ -1708,180 +1629,7 @@
         </w:tc>
         <w:tc>
           <w:tcPr>
-            <w:tcW w:w="1094" w:type="dxa"/>
-            <w:gridSpan w:val="2"/>
-            <w:shd w:val="clear" w:color="auto" w:fill="FFFFFF" w:themeFill="background1"/>
-          </w:tcPr>
-          <w:p>
-            <w:pPr>
-              <w:pStyle w:val="TableParagraph"/>
-              <w:spacing w:line="207" w:lineRule="exact"/>
-              <w:ind w:left="264"/>
-              <w:rPr>
-                <w:b/>
-                <w:sz w:val="20"/>
-              </w:rPr>
-            </w:pPr>
-            <w:r>
-              <w:rPr>
-                <w:b/>
-                <w:sz w:val="20"/>
-              </w:rPr>
-              <w:t xml:space="preserve">1 </w:t>
-            </w:r>
-            <w:r>
-              <w:rPr>
-                <w:b/>
-                <w:spacing w:val="-4"/>
-                <w:sz w:val="20"/>
-              </w:rPr>
-              <w:t>курс</w:t>
-            </w:r>
-          </w:p>
-        </w:tc>
-        <w:tc>
-          <w:tcPr>
-            <w:tcW w:w="1133" w:type="dxa"/>
-            <w:gridSpan w:val="2"/>
-            <w:shd w:val="clear" w:color="auto" w:fill="FFFFFF" w:themeFill="background1"/>
-          </w:tcPr>
-          <w:p>
-            <w:pPr>
-              <w:pStyle w:val="TableParagraph"/>
-              <w:spacing w:line="207" w:lineRule="exact"/>
-              <w:ind w:left="284"/>
-              <w:rPr>
-                <w:b/>
-                <w:sz w:val="20"/>
-              </w:rPr>
-            </w:pPr>
-            <w:r>
-              <w:rPr>
-                <w:b/>
-                <w:sz w:val="20"/>
-              </w:rPr>
-              <w:t xml:space="preserve">2 </w:t>
-            </w:r>
-            <w:r>
-              <w:rPr>
-                <w:b/>
-                <w:spacing w:val="-4"/>
-                <w:sz w:val="20"/>
-              </w:rPr>
-              <w:t>курс</w:t>
-            </w:r>
-          </w:p>
-        </w:tc>
-        <w:tc>
-          <w:tcPr>
-            <w:tcW w:w="1419" w:type="dxa"/>
-            <w:gridSpan w:val="2"/>
-            <w:shd w:val="clear" w:color="auto" w:fill="FFFFFF" w:themeFill="background1"/>
-          </w:tcPr>
-          <w:p>
-            <w:pPr>
-              <w:pStyle w:val="TableParagraph"/>
-              <w:spacing w:line="207" w:lineRule="exact"/>
-              <w:ind w:left="428"/>
-              <w:rPr>
-                <w:b/>
-                <w:sz w:val="20"/>
-              </w:rPr>
-            </w:pPr>
-            <w:r>
-              <w:rPr>
-                <w:b/>
-                <w:sz w:val="20"/>
-              </w:rPr>
-              <w:t xml:space="preserve">3 </w:t>
-            </w:r>
-            <w:r>
-              <w:rPr>
-                <w:b/>
-                <w:spacing w:val="-4"/>
-                <w:sz w:val="20"/>
-              </w:rPr>
-              <w:t>курс</w:t>
-            </w:r>
-          </w:p>
-        </w:tc>
-        <w:tc>
-          <w:tcPr>
-            <w:tcW w:w="1308" w:type="dxa"/>
-            <w:gridSpan w:val="2"/>
-            <w:shd w:val="clear" w:color="auto" w:fill="FFFFFF" w:themeFill="background1"/>
-          </w:tcPr>
-          <w:p>
-            <w:pPr>
-              <w:pStyle w:val="TableParagraph"/>
-              <w:spacing w:line="207" w:lineRule="exact"/>
-              <w:ind w:left="370"/>
-              <w:rPr>
-                <w:b/>
-                <w:sz w:val="20"/>
-              </w:rPr>
-            </w:pPr>
-            <w:r>
-              <w:rPr>
-                <w:b/>
-                <w:sz w:val="20"/>
-              </w:rPr>
-              <w:t xml:space="preserve">4 </w:t>
-            </w:r>
-            <w:r>
-              <w:rPr>
-                <w:b/>
-                <w:spacing w:val="-4"/>
-                <w:sz w:val="20"/>
-              </w:rPr>
-              <w:t>курс</w:t>
-            </w:r>
-          </w:p>
-        </w:tc>
-      </w:tr>
-      <w:tr>
-        <w:trPr>
-          <w:trHeight w:val="225"/>
-        </w:trPr>
-        <w:tc>
-          <w:tcPr>
-            <w:tcW w:w="1714" w:type="dxa"/>
-            <w:vMerge/>
-            <w:tcBorders>
-              <w:top w:val="nil"/>
-            </w:tcBorders>
-            <w:shd w:val="clear" w:color="auto" w:fill="FFFFFF" w:themeFill="background1"/>
-          </w:tcPr>
-          <w:p>
-            <w:pPr>
-              <w:rPr>
-                <w:sz w:val="2"/>
-                <w:szCs w:val="2"/>
-              </w:rPr>
-            </w:pPr>
-          </w:p>
-        </w:tc>
-        <w:tc>
-          <w:tcPr>
-            <w:tcW w:w="2705" w:type="dxa"/>
-            <w:vMerge/>
-            <w:tcBorders>
-              <w:top w:val="nil"/>
-            </w:tcBorders>
-            <w:shd w:val="clear" w:color="auto" w:fill="FFFFFF" w:themeFill="background1"/>
-          </w:tcPr>
-          <w:p>
-            <w:pPr>
-              <w:rPr>
-                <w:sz w:val="2"/>
-                <w:szCs w:val="2"/>
-              </w:rPr>
-            </w:pPr>
-          </w:p>
-        </w:tc>
-        <w:tc>
-          <w:tcPr>
-            <w:tcW w:w="566" w:type="dxa"/>
+            <w:tcW w:w="511" w:type="dxa"/>
             <w:shd w:val="clear" w:color="auto" w:fill="FFFFFF" w:themeFill="background1"/>
           </w:tcPr>
           <w:p>
@@ -1892,22 +1640,24 @@
               <w:jc w:val="center"/>
               <w:rPr>
                 <w:b/>
-                <w:sz w:val="20"/>
+                <w:bCs/>
+                <w:sz w:val="20"/>
+                <w:lang w:val="en-US"/>
               </w:rPr>
             </w:pPr>
             <w:r>
               <w:rPr>
                 <w:b/>
-                <w:spacing w:val="-10"/>
-                <w:sz w:val="20"/>
-              </w:rPr>
-              <w:t>1</w:t>
+                <w:bCs/>
+                <w:lang w:val="en-US"/>
+              </w:rPr>
+              <w:t>{%- for sem in semester_headers %}</w:t>
             </w:r>
           </w:p>
         </w:tc>
         <w:tc>
           <w:tcPr>
-            <w:tcW w:w="528" w:type="dxa"/>
+            <w:tcW w:w="583" w:type="dxa"/>
             <w:shd w:val="clear" w:color="auto" w:fill="FFFFFF" w:themeFill="background1"/>
           </w:tcPr>
           <w:p>
@@ -1918,22 +1668,31 @@
               <w:jc w:val="center"/>
               <w:rPr>
                 <w:b/>
+                <w:bCs/>
                 <w:sz w:val="20"/>
               </w:rPr>
             </w:pPr>
-            <w:r>
-              <w:rPr>
-                <w:b/>
-                <w:spacing w:val="-10"/>
-                <w:sz w:val="20"/>
-              </w:rPr>
-              <w:t>2</w:t>
+            <w:proofErr w:type="gramStart"/>
+            <w:r>
+              <w:rPr>
+                <w:b/>
+                <w:bCs/>
+              </w:rPr>
+              <w:t>{{ sem</w:t>
+            </w:r>
+            <w:proofErr w:type="gramEnd"/>
+            <w:r>
+              <w:rPr>
+                <w:b/>
+                <w:bCs/>
+              </w:rPr>
+              <w:t xml:space="preserve"> }} семестр</w:t>
             </w:r>
           </w:p>
         </w:tc>
         <w:tc>
           <w:tcPr>
-            <w:tcW w:w="567" w:type="dxa"/>
+            <w:tcW w:w="551" w:type="dxa"/>
             <w:shd w:val="clear" w:color="auto" w:fill="FFFFFF" w:themeFill="background1"/>
           </w:tcPr>
           <w:p>
@@ -1944,146 +1703,16 @@
               <w:jc w:val="center"/>
               <w:rPr>
                 <w:b/>
+                <w:bCs/>
                 <w:sz w:val="20"/>
               </w:rPr>
             </w:pPr>
             <w:r>
               <w:rPr>
                 <w:b/>
-                <w:spacing w:val="-10"/>
-                <w:sz w:val="20"/>
-              </w:rPr>
-              <w:t>3</w:t>
-            </w:r>
-          </w:p>
-        </w:tc>
-        <w:tc>
-          <w:tcPr>
-            <w:tcW w:w="566" w:type="dxa"/>
-            <w:shd w:val="clear" w:color="auto" w:fill="FFFFFF" w:themeFill="background1"/>
-          </w:tcPr>
-          <w:p>
-            <w:pPr>
-              <w:pStyle w:val="TableParagraph"/>
-              <w:spacing w:line="205" w:lineRule="exact"/>
-              <w:ind w:left="21" w:right="2"/>
-              <w:jc w:val="center"/>
-              <w:rPr>
-                <w:b/>
-                <w:sz w:val="20"/>
-              </w:rPr>
-            </w:pPr>
-            <w:r>
-              <w:rPr>
-                <w:b/>
-                <w:spacing w:val="-10"/>
-                <w:sz w:val="20"/>
-              </w:rPr>
-              <w:t>4</w:t>
-            </w:r>
-          </w:p>
-        </w:tc>
-        <w:tc>
-          <w:tcPr>
-            <w:tcW w:w="708" w:type="dxa"/>
-            <w:shd w:val="clear" w:color="auto" w:fill="FFFFFF" w:themeFill="background1"/>
-          </w:tcPr>
-          <w:p>
-            <w:pPr>
-              <w:pStyle w:val="TableParagraph"/>
-              <w:spacing w:line="205" w:lineRule="exact"/>
-              <w:ind w:left="17"/>
-              <w:jc w:val="center"/>
-              <w:rPr>
-                <w:b/>
-                <w:sz w:val="20"/>
-              </w:rPr>
-            </w:pPr>
-            <w:r>
-              <w:rPr>
-                <w:b/>
-                <w:spacing w:val="-10"/>
-                <w:sz w:val="20"/>
-              </w:rPr>
-              <w:t>5</w:t>
-            </w:r>
-          </w:p>
-        </w:tc>
-        <w:tc>
-          <w:tcPr>
-            <w:tcW w:w="711" w:type="dxa"/>
-            <w:shd w:val="clear" w:color="auto" w:fill="FFFFFF" w:themeFill="background1"/>
-          </w:tcPr>
-          <w:p>
-            <w:pPr>
-              <w:pStyle w:val="TableParagraph"/>
-              <w:spacing w:line="205" w:lineRule="exact"/>
-              <w:ind w:left="14"/>
-              <w:jc w:val="center"/>
-              <w:rPr>
-                <w:b/>
-                <w:sz w:val="20"/>
-              </w:rPr>
-            </w:pPr>
-            <w:r>
-              <w:rPr>
-                <w:b/>
-                <w:spacing w:val="-10"/>
-                <w:sz w:val="20"/>
-              </w:rPr>
-              <w:t>6</w:t>
-            </w:r>
-          </w:p>
-        </w:tc>
-        <w:tc>
-          <w:tcPr>
-            <w:tcW w:w="708" w:type="dxa"/>
-            <w:shd w:val="clear" w:color="auto" w:fill="FFFFFF" w:themeFill="background1"/>
-          </w:tcPr>
-          <w:p>
-            <w:pPr>
-              <w:pStyle w:val="TableParagraph"/>
-              <w:spacing w:line="205" w:lineRule="exact"/>
-              <w:ind w:left="17" w:right="5"/>
-              <w:jc w:val="center"/>
-              <w:rPr>
-                <w:b/>
-                <w:sz w:val="20"/>
-              </w:rPr>
-            </w:pPr>
-            <w:r>
-              <w:rPr>
-                <w:b/>
-                <w:spacing w:val="-10"/>
-                <w:sz w:val="20"/>
-              </w:rPr>
-              <w:t>7</w:t>
-            </w:r>
-          </w:p>
-        </w:tc>
-        <w:tc>
-          <w:tcPr>
-            <w:tcW w:w="600" w:type="dxa"/>
-            <w:shd w:val="clear" w:color="auto" w:fill="FFFFFF" w:themeFill="background1"/>
-          </w:tcPr>
-          <w:p>
-            <w:pPr>
-              <w:pStyle w:val="TableParagraph"/>
-              <w:spacing w:line="205" w:lineRule="exact"/>
-              <w:ind w:left="19"/>
-              <w:jc w:val="center"/>
-              <w:rPr>
-                <w:b/>
-                <w:sz w:val="20"/>
-              </w:rPr>
-            </w:pPr>
-            <w:r>
-              <w:rPr>
-                <w:b/>
-                <w:spacing w:val="-10"/>
-                <w:sz w:val="20"/>
-              </w:rPr>
-              <w:t>8</w:t>
+                <w:bCs/>
+              </w:rPr>
+              <w:t>{%- endfor %}</w:t>
             </w:r>
           </w:p>
         </w:tc>
@@ -2094,8 +1723,8 @@
         </w:trPr>
         <w:tc>
           <w:tcPr>
-            <w:tcW w:w="9373" w:type="dxa"/>
-            <w:gridSpan w:val="10"/>
+            <w:tcW w:w="6064" w:type="dxa"/>
+            <w:gridSpan w:val="5"/>
             <w:shd w:val="clear" w:color="auto" w:fill="FFFFFF" w:themeFill="background1"/>
           </w:tcPr>
           <w:p>
@@ -2117,16 +1746,7 @@
                 <w:sz w:val="20"/>
                 <w:lang w:val="en-US"/>
               </w:rPr>
-              <w:t xml:space="preserve">{{ </w:t>
-            </w:r>
-            <w:proofErr w:type="spellStart"/>
-            <w:r>
-              <w:rPr>
-                <w:b/>
-                <w:sz w:val="20"/>
-                <w:lang w:val="en-US"/>
-              </w:rPr>
-              <w:t>item</w:t>
+              <w:t>{{ item</w:t>
             </w:r>
             <w:proofErr w:type="gramEnd"/>
             <w:r>
@@ -2144,16 +1764,7 @@
                 <w:sz w:val="20"/>
                 <w:lang w:val="en-US"/>
               </w:rPr>
-              <w:t>index</w:t>
-            </w:r>
-            <w:proofErr w:type="spellEnd"/>
-            <w:r>
-              <w:rPr>
-                <w:b/>
-                <w:sz w:val="20"/>
-                <w:lang w:val="en-US"/>
-              </w:rPr>
-              <w:t xml:space="preserve"> }</w:t>
+              <w:t>index }</w:t>
             </w:r>
             <w:proofErr w:type="gramEnd"/>
             <w:r>
@@ -2171,16 +1782,7 @@
                 <w:sz w:val="20"/>
                 <w:lang w:val="en-US"/>
               </w:rPr>
-              <w:t xml:space="preserve">{{ </w:t>
-            </w:r>
-            <w:proofErr w:type="spellStart"/>
-            <w:r>
-              <w:rPr>
-                <w:b/>
-                <w:sz w:val="20"/>
-                <w:lang w:val="en-US"/>
-              </w:rPr>
-              <w:t>item</w:t>
+              <w:t>{{ item</w:t>
             </w:r>
             <w:proofErr w:type="gramEnd"/>
             <w:r>
@@ -2189,16 +1791,7 @@
                 <w:sz w:val="20"/>
                 <w:lang w:val="en-US"/>
               </w:rPr>
-              <w:t>.competence</w:t>
-            </w:r>
-            <w:proofErr w:type="spellEnd"/>
-            <w:r>
-              <w:rPr>
-                <w:b/>
-                <w:sz w:val="20"/>
-                <w:lang w:val="en-US"/>
-              </w:rPr>
-              <w:t xml:space="preserve"> }}</w:t>
+              <w:t>.competence }}</w:t>
             </w:r>
           </w:p>
         </w:tc>
@@ -2209,8 +1802,8 @@
         </w:trPr>
         <w:tc>
           <w:tcPr>
-            <w:tcW w:w="9373" w:type="dxa"/>
-            <w:gridSpan w:val="10"/>
+            <w:tcW w:w="6064" w:type="dxa"/>
+            <w:gridSpan w:val="5"/>
             <w:shd w:val="clear" w:color="auto" w:fill="FFFFFF" w:themeFill="background1"/>
           </w:tcPr>
           <w:p>
@@ -2249,7 +1842,6 @@
               </w:rPr>
               <w:t xml:space="preserve"> for disc in </w:t>
             </w:r>
-            <w:proofErr w:type="spellStart"/>
             <w:proofErr w:type="gramStart"/>
             <w:r>
               <w:rPr>
@@ -2266,16 +1858,7 @@
                 <w:sz w:val="20"/>
                 <w:lang w:val="en-US"/>
               </w:rPr>
-              <w:t>_fragment</w:t>
-            </w:r>
-            <w:proofErr w:type="spellEnd"/>
-            <w:r>
-              <w:rPr>
-                <w:bCs/>
-                <w:sz w:val="20"/>
-                <w:lang w:val="en-US"/>
-              </w:rPr>
-              <w:t xml:space="preserve"> %}</w:t>
+              <w:t>_fragment %}</w:t>
             </w:r>
           </w:p>
         </w:tc>
@@ -2304,31 +1887,15 @@
                 <w:spacing w:val="-2"/>
                 <w:sz w:val="20"/>
               </w:rPr>
-              <w:t xml:space="preserve">{{ </w:t>
-            </w:r>
-            <w:proofErr w:type="spellStart"/>
+              <w:t>{{ disc</w:t>
+            </w:r>
+            <w:proofErr w:type="gramEnd"/>
             <w:r>
               <w:rPr>
                 <w:spacing w:val="-2"/>
                 <w:sz w:val="20"/>
               </w:rPr>
-              <w:t>disc</w:t>
-            </w:r>
-            <w:proofErr w:type="gramEnd"/>
-            <w:r>
-              <w:rPr>
-                <w:spacing w:val="-2"/>
-                <w:sz w:val="20"/>
-              </w:rPr>
-              <w:t>.discipline_index</w:t>
-            </w:r>
-            <w:proofErr w:type="spellEnd"/>
-            <w:r>
-              <w:rPr>
-                <w:spacing w:val="-2"/>
-                <w:sz w:val="20"/>
-              </w:rPr>
-              <w:t xml:space="preserve"> }}</w:t>
+              <w:t>.discipline_index }}</w:t>
             </w:r>
           </w:p>
         </w:tc>
@@ -2352,36 +1919,21 @@
               <w:rPr>
                 <w:sz w:val="20"/>
               </w:rPr>
-              <w:t xml:space="preserve">{{ </w:t>
-            </w:r>
-            <w:proofErr w:type="spellStart"/>
-            <w:r>
-              <w:rPr>
-                <w:sz w:val="20"/>
-              </w:rPr>
-              <w:t>disc</w:t>
+              <w:t>{{ disc</w:t>
             </w:r>
             <w:proofErr w:type="gramEnd"/>
             <w:r>
               <w:rPr>
                 <w:sz w:val="20"/>
               </w:rPr>
-              <w:t>.discipline_name</w:t>
-            </w:r>
-            <w:proofErr w:type="spellEnd"/>
-            <w:r>
-              <w:rPr>
-                <w:sz w:val="20"/>
-              </w:rPr>
-              <w:t xml:space="preserve"> }}</w:t>
+              <w:t>.discipline_name }}</w:t>
             </w:r>
           </w:p>
         </w:tc>
         <w:tc>
           <w:tcPr>
-            <w:tcW w:w="566" w:type="dxa"/>
+            <w:tcW w:w="511" w:type="dxa"/>
             <w:shd w:val="clear" w:color="auto" w:fill="FFFFFF" w:themeFill="background1"/>
-            <w:vAlign w:val="center"/>
           </w:tcPr>
           <w:p>
             <w:pPr>
@@ -2389,29 +1941,21 @@
               <w:jc w:val="center"/>
               <w:rPr>
                 <w:sz w:val="20"/>
+                <w:lang w:val="en-US"/>
               </w:rPr>
             </w:pPr>
-            <w:proofErr w:type="gramStart"/>
-            <w:r>
-              <w:rPr>
-                <w:sz w:val="20"/>
-              </w:rPr>
-              <w:t>{{ disc</w:t>
-            </w:r>
-            <w:proofErr w:type="gramEnd"/>
-            <w:r>
-              <w:rPr>
-                <w:sz w:val="20"/>
-              </w:rPr>
-              <w:t>.semester_1 }}</w:t>
+            <w:r>
+              <w:rPr>
+                <w:lang w:val="en-US"/>
+              </w:rPr>
+              <w:t>{%- for sem in semester_headers %}</w:t>
             </w:r>
           </w:p>
         </w:tc>
         <w:tc>
           <w:tcPr>
-            <w:tcW w:w="528" w:type="dxa"/>
+            <w:tcW w:w="583" w:type="dxa"/>
             <w:shd w:val="clear" w:color="auto" w:fill="FFFFFF" w:themeFill="background1"/>
-            <w:vAlign w:val="center"/>
           </w:tcPr>
           <w:p>
             <w:pPr>
@@ -2419,56 +1963,29 @@
               <w:jc w:val="center"/>
               <w:rPr>
                 <w:sz w:val="20"/>
+                <w:lang w:val="en-US"/>
               </w:rPr>
             </w:pPr>
             <w:proofErr w:type="gramStart"/>
             <w:r>
               <w:rPr>
-                <w:sz w:val="20"/>
-              </w:rPr>
-              <w:t xml:space="preserve">{{ </w:t>
-            </w:r>
-            <w:proofErr w:type="spellStart"/>
-            <w:r>
-              <w:rPr>
-                <w:sz w:val="20"/>
-              </w:rPr>
-              <w:t>disc</w:t>
+                <w:lang w:val="en-US"/>
+              </w:rPr>
+              <w:t>{{ disc</w:t>
             </w:r>
             <w:proofErr w:type="gramEnd"/>
             <w:r>
               <w:rPr>
-                <w:sz w:val="20"/>
-              </w:rPr>
-              <w:t>.semester</w:t>
-            </w:r>
-            <w:proofErr w:type="spellEnd"/>
-            <w:r>
-              <w:rPr>
-                <w:sz w:val="20"/>
-              </w:rPr>
-              <w:t>_</w:t>
-            </w:r>
-            <w:r>
-              <w:rPr>
-                <w:sz w:val="20"/>
-                <w:lang w:val="en-US"/>
-              </w:rPr>
-              <w:t>2</w:t>
-            </w:r>
-            <w:r>
-              <w:rPr>
-                <w:sz w:val="20"/>
-              </w:rPr>
-              <w:t xml:space="preserve"> }}</w:t>
+                <w:lang w:val="en-US"/>
+              </w:rPr>
+              <w:t>['semester_' + sem|string] }}</w:t>
             </w:r>
           </w:p>
         </w:tc>
         <w:tc>
           <w:tcPr>
-            <w:tcW w:w="567" w:type="dxa"/>
+            <w:tcW w:w="551" w:type="dxa"/>
             <w:shd w:val="clear" w:color="auto" w:fill="FFFFFF" w:themeFill="background1"/>
-            <w:vAlign w:val="center"/>
           </w:tcPr>
           <w:p>
             <w:pPr>
@@ -2479,337 +1996,8 @@
                 <w:sz w:val="20"/>
               </w:rPr>
             </w:pPr>
-            <w:proofErr w:type="gramStart"/>
-            <w:r>
-              <w:rPr>
-                <w:spacing w:val="-4"/>
-                <w:sz w:val="20"/>
-              </w:rPr>
-              <w:t xml:space="preserve">{{ </w:t>
-            </w:r>
-            <w:proofErr w:type="spellStart"/>
-            <w:r>
-              <w:rPr>
-                <w:spacing w:val="-4"/>
-                <w:sz w:val="20"/>
-              </w:rPr>
-              <w:t>disc</w:t>
-            </w:r>
-            <w:proofErr w:type="gramEnd"/>
-            <w:r>
-              <w:rPr>
-                <w:spacing w:val="-4"/>
-                <w:sz w:val="20"/>
-              </w:rPr>
-              <w:t>.semester</w:t>
-            </w:r>
-            <w:proofErr w:type="spellEnd"/>
-            <w:r>
-              <w:rPr>
-                <w:spacing w:val="-4"/>
-                <w:sz w:val="20"/>
-              </w:rPr>
-              <w:t>_</w:t>
-            </w:r>
-            <w:r>
-              <w:rPr>
-                <w:spacing w:val="-4"/>
-                <w:sz w:val="20"/>
-                <w:lang w:val="en-US"/>
-              </w:rPr>
-              <w:t>3</w:t>
-            </w:r>
-            <w:r>
-              <w:rPr>
-                <w:spacing w:val="-4"/>
-                <w:sz w:val="20"/>
-              </w:rPr>
-              <w:t xml:space="preserve"> }}</w:t>
-            </w:r>
-          </w:p>
-        </w:tc>
-        <w:tc>
-          <w:tcPr>
-            <w:tcW w:w="566" w:type="dxa"/>
-            <w:shd w:val="clear" w:color="auto" w:fill="FFFFFF" w:themeFill="background1"/>
-            <w:vAlign w:val="center"/>
-          </w:tcPr>
-          <w:p>
-            <w:pPr>
-              <w:pStyle w:val="TableParagraph"/>
-              <w:jc w:val="center"/>
-              <w:rPr>
-                <w:sz w:val="20"/>
-              </w:rPr>
-            </w:pPr>
-            <w:proofErr w:type="gramStart"/>
-            <w:r>
-              <w:rPr>
-                <w:sz w:val="20"/>
-              </w:rPr>
-              <w:t xml:space="preserve">{{ </w:t>
-            </w:r>
-            <w:proofErr w:type="spellStart"/>
-            <w:r>
-              <w:rPr>
-                <w:sz w:val="20"/>
-              </w:rPr>
-              <w:t>disc</w:t>
-            </w:r>
-            <w:proofErr w:type="gramEnd"/>
-            <w:r>
-              <w:rPr>
-                <w:sz w:val="20"/>
-              </w:rPr>
-              <w:t>.semester</w:t>
-            </w:r>
-            <w:proofErr w:type="spellEnd"/>
-            <w:r>
-              <w:rPr>
-                <w:sz w:val="20"/>
-              </w:rPr>
-              <w:t>_</w:t>
-            </w:r>
-            <w:r>
-              <w:rPr>
-                <w:sz w:val="20"/>
-                <w:lang w:val="en-US"/>
-              </w:rPr>
-              <w:t>4</w:t>
-            </w:r>
-            <w:r>
-              <w:rPr>
-                <w:sz w:val="20"/>
-              </w:rPr>
-              <w:t xml:space="preserve"> }}</w:t>
-            </w:r>
-          </w:p>
-        </w:tc>
-        <w:tc>
-          <w:tcPr>
-            <w:tcW w:w="708" w:type="dxa"/>
-            <w:shd w:val="clear" w:color="auto" w:fill="FFFFFF" w:themeFill="background1"/>
-            <w:vAlign w:val="center"/>
-          </w:tcPr>
-          <w:p>
-            <w:pPr>
-              <w:pStyle w:val="TableParagraph"/>
-              <w:jc w:val="center"/>
-              <w:rPr>
-                <w:sz w:val="20"/>
-              </w:rPr>
-            </w:pPr>
-            <w:proofErr w:type="gramStart"/>
-            <w:r>
-              <w:rPr>
-                <w:sz w:val="20"/>
-              </w:rPr>
-              <w:t xml:space="preserve">{{ </w:t>
-            </w:r>
-            <w:proofErr w:type="spellStart"/>
-            <w:r>
-              <w:rPr>
-                <w:sz w:val="20"/>
-              </w:rPr>
-              <w:t>disc</w:t>
-            </w:r>
-            <w:proofErr w:type="gramEnd"/>
-            <w:r>
-              <w:rPr>
-                <w:sz w:val="20"/>
-              </w:rPr>
-              <w:t>.semester</w:t>
-            </w:r>
-            <w:proofErr w:type="spellEnd"/>
-            <w:r>
-              <w:rPr>
-                <w:sz w:val="20"/>
-              </w:rPr>
-              <w:t>_</w:t>
-            </w:r>
-            <w:r>
-              <w:rPr>
-                <w:sz w:val="20"/>
-                <w:lang w:val="en-US"/>
-              </w:rPr>
-              <w:t>5</w:t>
-            </w:r>
-            <w:r>
-              <w:rPr>
-                <w:sz w:val="20"/>
-              </w:rPr>
-              <w:t xml:space="preserve"> }}</w:t>
-            </w:r>
-          </w:p>
-        </w:tc>
-        <w:tc>
-          <w:tcPr>
-            <w:tcW w:w="711" w:type="dxa"/>
-            <w:shd w:val="clear" w:color="auto" w:fill="FFFFFF" w:themeFill="background1"/>
-            <w:vAlign w:val="center"/>
-          </w:tcPr>
-          <w:p>
-            <w:pPr>
-              <w:pStyle w:val="TableParagraph"/>
-              <w:jc w:val="center"/>
-              <w:rPr>
-                <w:sz w:val="20"/>
-              </w:rPr>
-            </w:pPr>
-            <w:proofErr w:type="gramStart"/>
-            <w:r>
-              <w:rPr>
-                <w:sz w:val="20"/>
-              </w:rPr>
-              <w:t xml:space="preserve">{{ </w:t>
-            </w:r>
-            <w:proofErr w:type="spellStart"/>
-            <w:r>
-              <w:rPr>
-                <w:sz w:val="20"/>
-              </w:rPr>
-              <w:t>disc</w:t>
-            </w:r>
-            <w:proofErr w:type="gramEnd"/>
-            <w:r>
-              <w:rPr>
-                <w:sz w:val="20"/>
-              </w:rPr>
-              <w:t>.semester</w:t>
-            </w:r>
-            <w:proofErr w:type="spellEnd"/>
-            <w:r>
-              <w:rPr>
-                <w:sz w:val="20"/>
-              </w:rPr>
-              <w:t>_</w:t>
-            </w:r>
-            <w:r>
-              <w:rPr>
-                <w:sz w:val="20"/>
-                <w:lang w:val="en-US"/>
-              </w:rPr>
-              <w:t>6</w:t>
-            </w:r>
-            <w:r>
-              <w:rPr>
-                <w:sz w:val="20"/>
-              </w:rPr>
-              <w:t xml:space="preserve"> }}</w:t>
-            </w:r>
-          </w:p>
-        </w:tc>
-        <w:tc>
-          <w:tcPr>
-            <w:tcW w:w="708" w:type="dxa"/>
-            <w:shd w:val="clear" w:color="auto" w:fill="FFFFFF" w:themeFill="background1"/>
-            <w:vAlign w:val="center"/>
-          </w:tcPr>
-          <w:p>
-            <w:pPr>
-              <w:pStyle w:val="TableParagraph"/>
-              <w:jc w:val="center"/>
-              <w:rPr>
-                <w:sz w:val="20"/>
-              </w:rPr>
-            </w:pPr>
-            <w:proofErr w:type="gramStart"/>
-            <w:r>
-              <w:rPr>
-                <w:sz w:val="20"/>
-              </w:rPr>
-              <w:t xml:space="preserve">{{ </w:t>
-            </w:r>
-            <w:proofErr w:type="spellStart"/>
-            <w:r>
-              <w:rPr>
-                <w:sz w:val="20"/>
-              </w:rPr>
-              <w:t>disc</w:t>
-            </w:r>
-            <w:proofErr w:type="gramEnd"/>
-            <w:r>
-              <w:rPr>
-                <w:sz w:val="20"/>
-              </w:rPr>
-              <w:t>.semester</w:t>
-            </w:r>
-            <w:proofErr w:type="spellEnd"/>
-            <w:r>
-              <w:rPr>
-                <w:sz w:val="20"/>
-              </w:rPr>
-              <w:t>_</w:t>
-            </w:r>
-            <w:r>
-              <w:rPr>
-                <w:sz w:val="20"/>
-                <w:lang w:val="en-US"/>
-              </w:rPr>
-              <w:t>7</w:t>
-            </w:r>
-            <w:r>
-              <w:rPr>
-                <w:sz w:val="20"/>
-              </w:rPr>
-              <w:t xml:space="preserve"> }}</w:t>
-            </w:r>
-          </w:p>
-        </w:tc>
-        <w:tc>
-          <w:tcPr>
-            <w:tcW w:w="600" w:type="dxa"/>
-            <w:shd w:val="clear" w:color="auto" w:fill="FFFFFF" w:themeFill="background1"/>
-            <w:vAlign w:val="center"/>
-          </w:tcPr>
-          <w:p>
-            <w:pPr>
-              <w:pStyle w:val="TableParagraph"/>
-              <w:jc w:val="center"/>
-              <w:rPr>
-                <w:sz w:val="20"/>
-              </w:rPr>
-            </w:pPr>
-            <w:proofErr w:type="gramStart"/>
-            <w:r>
-              <w:rPr>
-                <w:sz w:val="20"/>
-              </w:rPr>
-              <w:t xml:space="preserve">{{ </w:t>
-            </w:r>
-            <w:proofErr w:type="spellStart"/>
-            <w:r>
-              <w:rPr>
-                <w:sz w:val="20"/>
-              </w:rPr>
-              <w:t>disc</w:t>
-            </w:r>
-            <w:proofErr w:type="gramEnd"/>
-            <w:r>
-              <w:rPr>
-                <w:sz w:val="20"/>
-              </w:rPr>
-              <w:t>.semester</w:t>
-            </w:r>
-            <w:proofErr w:type="spellEnd"/>
-            <w:r>
-              <w:rPr>
-                <w:sz w:val="20"/>
-              </w:rPr>
-              <w:t>_</w:t>
-            </w:r>
-            <w:r>
-              <w:rPr>
-                <w:sz w:val="20"/>
-                <w:lang w:val="en-US"/>
-              </w:rPr>
-              <w:t>8</w:t>
-            </w:r>
-            <w:r>
-              <w:rPr>
-                <w:sz w:val="20"/>
-              </w:rPr>
-              <w:t xml:space="preserve"> }}</w:t>
+            <w:r>
+              <w:t>{%- endfor %}</w:t>
             </w:r>
           </w:p>
         </w:tc>
@@ -2820,8 +2008,8 @@
         </w:trPr>
         <w:tc>
           <w:tcPr>
-            <w:tcW w:w="9373" w:type="dxa"/>
-            <w:gridSpan w:val="10"/>
+            <w:tcW w:w="6064" w:type="dxa"/>
+            <w:gridSpan w:val="5"/>
             <w:shd w:val="clear" w:color="auto" w:fill="FFFFFF" w:themeFill="background1"/>
           </w:tcPr>
           <w:p>
@@ -2836,35 +2024,7 @@
               <w:rPr>
                 <w:sz w:val="20"/>
               </w:rPr>
-              <w:t>{%</w:t>
-            </w:r>
-            <w:proofErr w:type="spellStart"/>
-            <w:r>
-              <w:rPr>
-                <w:sz w:val="20"/>
-              </w:rPr>
-              <w:t>tr</w:t>
-            </w:r>
-            <w:proofErr w:type="spellEnd"/>
-            <w:r>
-              <w:rPr>
-                <w:sz w:val="20"/>
-              </w:rPr>
-              <w:t xml:space="preserve"> </w:t>
-            </w:r>
-            <w:proofErr w:type="spellStart"/>
-            <w:r>
-              <w:rPr>
-                <w:sz w:val="20"/>
-              </w:rPr>
-              <w:t>endfor</w:t>
-            </w:r>
-            <w:proofErr w:type="spellEnd"/>
-            <w:r>
-              <w:rPr>
-                <w:sz w:val="20"/>
-              </w:rPr>
-              <w:t xml:space="preserve"> %</w:t>
+              <w:t>{%tr endfor %</w:t>
             </w:r>
             <w:r>
               <w:rPr>
@@ -3083,15 +2243,7 @@
                 <w:sz w:val="20"/>
                 <w:lang w:val="en-US"/>
               </w:rPr>
-              <w:t xml:space="preserve">{{ </w:t>
-            </w:r>
-            <w:proofErr w:type="spellStart"/>
-            <w:r>
-              <w:rPr>
-                <w:sz w:val="20"/>
-                <w:lang w:val="en-US"/>
-              </w:rPr>
-              <w:t>item</w:t>
+              <w:t>{{ item</w:t>
             </w:r>
             <w:proofErr w:type="gramEnd"/>
             <w:r>
@@ -3107,15 +2259,7 @@
                 <w:sz w:val="20"/>
                 <w:lang w:val="en-US"/>
               </w:rPr>
-              <w:t>index</w:t>
-            </w:r>
-            <w:proofErr w:type="spellEnd"/>
-            <w:r>
-              <w:rPr>
-                <w:sz w:val="20"/>
-                <w:lang w:val="en-US"/>
-              </w:rPr>
-              <w:t xml:space="preserve"> }</w:t>
+              <w:t>index }</w:t>
             </w:r>
             <w:proofErr w:type="gramEnd"/>
             <w:r>
@@ -3131,15 +2275,7 @@
                 <w:sz w:val="20"/>
                 <w:lang w:val="en-US"/>
               </w:rPr>
-              <w:t xml:space="preserve">{{ </w:t>
-            </w:r>
-            <w:proofErr w:type="spellStart"/>
-            <w:r>
-              <w:rPr>
-                <w:sz w:val="20"/>
-                <w:lang w:val="en-US"/>
-              </w:rPr>
-              <w:t>item</w:t>
+              <w:t>{{ item</w:t>
             </w:r>
             <w:proofErr w:type="gramEnd"/>
             <w:r>
@@ -3147,15 +2283,7 @@
                 <w:sz w:val="20"/>
                 <w:lang w:val="en-US"/>
               </w:rPr>
-              <w:t>.competence</w:t>
-            </w:r>
-            <w:proofErr w:type="spellEnd"/>
-            <w:r>
-              <w:rPr>
-                <w:sz w:val="20"/>
-                <w:lang w:val="en-US"/>
-              </w:rPr>
-              <w:t xml:space="preserve"> }}</w:t>
+              <w:t>.competence }}</w:t>
             </w:r>
           </w:p>
         </w:tc>
@@ -3178,28 +2306,14 @@
               <w:rPr>
                 <w:sz w:val="20"/>
               </w:rPr>
-              <w:t xml:space="preserve">{{ </w:t>
-            </w:r>
-            <w:proofErr w:type="spellStart"/>
-            <w:r>
-              <w:rPr>
-                <w:sz w:val="20"/>
-              </w:rPr>
-              <w:t>item</w:t>
+              <w:t>{{ item</w:t>
             </w:r>
             <w:proofErr w:type="gramEnd"/>
             <w:r>
               <w:rPr>
                 <w:sz w:val="20"/>
               </w:rPr>
-              <w:t>.competence_final_indicator</w:t>
-            </w:r>
-            <w:proofErr w:type="spellEnd"/>
-            <w:r>
-              <w:rPr>
-                <w:sz w:val="20"/>
-              </w:rPr>
-              <w:t xml:space="preserve"> }}</w:t>
+              <w:t>.competence_final_indicator }}</w:t>
             </w:r>
           </w:p>
         </w:tc>
@@ -3453,9 +2567,9 @@
                 <w:sz w:val="20"/>
                 <w:lang w:val="en-US"/>
               </w:rPr>
-              <w:t xml:space="preserve">{%tr for </w:t>
-            </w:r>
-            <w:proofErr w:type="spellStart"/>
+              <w:t xml:space="preserve">{%tr for ind in </w:t>
+            </w:r>
+            <w:proofErr w:type="gramStart"/>
             <w:r>
               <w:rPr>
                 <w:bCs/>
@@ -3463,9 +2577,9 @@
                 <w:sz w:val="20"/>
                 <w:lang w:val="en-US"/>
               </w:rPr>
-              <w:t>ind</w:t>
-            </w:r>
-            <w:proofErr w:type="spellEnd"/>
+              <w:t>item.indicator</w:t>
+            </w:r>
+            <w:proofErr w:type="gramEnd"/>
             <w:r>
               <w:rPr>
                 <w:bCs/>
@@ -3473,38 +2587,7 @@
                 <w:sz w:val="20"/>
                 <w:lang w:val="en-US"/>
               </w:rPr>
-              <w:t xml:space="preserve"> in </w:t>
-            </w:r>
-            <w:proofErr w:type="spellStart"/>
-            <w:proofErr w:type="gramStart"/>
-            <w:r>
-              <w:rPr>
-                <w:bCs/>
-                <w:spacing w:val="-2"/>
-                <w:sz w:val="20"/>
-                <w:lang w:val="en-US"/>
-              </w:rPr>
-              <w:t>item.indicator</w:t>
-            </w:r>
-            <w:proofErr w:type="gramEnd"/>
-            <w:r>
-              <w:rPr>
-                <w:bCs/>
-                <w:spacing w:val="-2"/>
-                <w:sz w:val="20"/>
-                <w:lang w:val="en-US"/>
-              </w:rPr>
-              <w:t>_list</w:t>
-            </w:r>
-            <w:proofErr w:type="spellEnd"/>
-            <w:r>
-              <w:rPr>
-                <w:bCs/>
-                <w:spacing w:val="-2"/>
-                <w:sz w:val="20"/>
-                <w:lang w:val="en-US"/>
-              </w:rPr>
-              <w:t xml:space="preserve"> %}</w:t>
+              <w:t>_list %}</w:t>
             </w:r>
           </w:p>
         </w:tc>
@@ -3532,7 +2615,6 @@
               </w:rPr>
               <w:t xml:space="preserve">{{ </w:t>
             </w:r>
-            <w:proofErr w:type="spellStart"/>
             <w:r>
               <w:rPr>
                 <w:bCs/>
@@ -3542,27 +2624,12 @@
               </w:rPr>
               <w:t>ind</w:t>
             </w:r>
-            <w:proofErr w:type="spellEnd"/>
             <w:proofErr w:type="gramEnd"/>
             <w:r>
               <w:rPr>
                 <w:sz w:val="20"/>
               </w:rPr>
-              <w:t>.</w:t>
-            </w:r>
-            <w:proofErr w:type="spellStart"/>
-            <w:r>
-              <w:rPr>
-                <w:sz w:val="20"/>
-              </w:rPr>
-              <w:t>indicator_index</w:t>
-            </w:r>
-            <w:proofErr w:type="spellEnd"/>
-            <w:r>
-              <w:rPr>
-                <w:sz w:val="20"/>
-              </w:rPr>
-              <w:t xml:space="preserve"> }}</w:t>
+              <w:t>.indicator_index }}</w:t>
             </w:r>
           </w:p>
         </w:tc>
@@ -3587,31 +2654,15 @@
                 <w:spacing w:val="-2"/>
                 <w:sz w:val="20"/>
               </w:rPr>
-              <w:t xml:space="preserve">{{ </w:t>
-            </w:r>
-            <w:proofErr w:type="spellStart"/>
+              <w:t>{{ ind</w:t>
+            </w:r>
+            <w:proofErr w:type="gramEnd"/>
             <w:r>
               <w:rPr>
                 <w:spacing w:val="-2"/>
                 <w:sz w:val="20"/>
               </w:rPr>
-              <w:t>ind</w:t>
-            </w:r>
-            <w:proofErr w:type="gramEnd"/>
-            <w:r>
-              <w:rPr>
-                <w:spacing w:val="-2"/>
-                <w:sz w:val="20"/>
-              </w:rPr>
-              <w:t>.indicator</w:t>
-            </w:r>
-            <w:proofErr w:type="spellEnd"/>
-            <w:r>
-              <w:rPr>
-                <w:spacing w:val="-2"/>
-                <w:sz w:val="20"/>
-              </w:rPr>
-              <w:t xml:space="preserve"> }}</w:t>
+              <w:t>.indicator }}</w:t>
             </w:r>
           </w:p>
         </w:tc>
@@ -3635,31 +2686,15 @@
                 <w:spacing w:val="-2"/>
                 <w:sz w:val="20"/>
               </w:rPr>
-              <w:t xml:space="preserve">{{ </w:t>
-            </w:r>
-            <w:proofErr w:type="spellStart"/>
+              <w:t>{{ ind</w:t>
+            </w:r>
+            <w:proofErr w:type="gramEnd"/>
             <w:r>
               <w:rPr>
                 <w:spacing w:val="-2"/>
                 <w:sz w:val="20"/>
               </w:rPr>
-              <w:t>ind</w:t>
-            </w:r>
-            <w:proofErr w:type="gramEnd"/>
-            <w:r>
-              <w:rPr>
-                <w:spacing w:val="-2"/>
-                <w:sz w:val="20"/>
-              </w:rPr>
-              <w:t>.discipline_name</w:t>
-            </w:r>
-            <w:proofErr w:type="spellEnd"/>
-            <w:r>
-              <w:rPr>
-                <w:spacing w:val="-2"/>
-                <w:sz w:val="20"/>
-              </w:rPr>
-              <w:t xml:space="preserve"> }}</w:t>
+              <w:t>.discipline_name }}</w:t>
             </w:r>
           </w:p>
         </w:tc>
@@ -3688,35 +2723,7 @@
               <w:rPr>
                 <w:sz w:val="20"/>
               </w:rPr>
-              <w:t>{%</w:t>
-            </w:r>
-            <w:proofErr w:type="spellStart"/>
-            <w:r>
-              <w:rPr>
-                <w:sz w:val="20"/>
-              </w:rPr>
-              <w:t>tr</w:t>
-            </w:r>
-            <w:proofErr w:type="spellEnd"/>
-            <w:r>
-              <w:rPr>
-                <w:sz w:val="20"/>
-              </w:rPr>
-              <w:t xml:space="preserve"> </w:t>
-            </w:r>
-            <w:proofErr w:type="spellStart"/>
-            <w:r>
-              <w:rPr>
-                <w:sz w:val="20"/>
-              </w:rPr>
-              <w:t>endfor</w:t>
-            </w:r>
-            <w:proofErr w:type="spellEnd"/>
-            <w:r>
-              <w:rPr>
-                <w:sz w:val="20"/>
-              </w:rPr>
-              <w:t xml:space="preserve"> %</w:t>
+              <w:t>{%tr endfor %</w:t>
             </w:r>
             <w:r>
               <w:rPr>
@@ -3761,13 +2768,10 @@
         <w:gridCol w:w="4253"/>
         <w:gridCol w:w="1417"/>
         <w:gridCol w:w="992"/>
-        <w:gridCol w:w="993"/>
-        <w:gridCol w:w="142"/>
+        <w:gridCol w:w="1135"/>
       </w:tblGrid>
       <w:tr>
         <w:trPr>
-          <w:gridAfter w:val="1"/>
-          <w:wAfter w:w="142" w:type="dxa"/>
           <w:trHeight w:val="319"/>
         </w:trPr>
         <w:tc>
@@ -3894,15 +2898,7 @@
                 <w:spacing w:val="-2"/>
                 <w:sz w:val="20"/>
               </w:rPr>
-              <w:t>индикато</w:t>
-            </w:r>
-            <w:r>
-              <w:rPr>
-                <w:b/>
-                <w:spacing w:val="-2"/>
-                <w:sz w:val="20"/>
-              </w:rPr>
-              <w:t xml:space="preserve">ра   </w:t>
+              <w:t xml:space="preserve">индикатора   </w:t>
             </w:r>
           </w:p>
         </w:tc>
@@ -3949,7 +2945,6 @@
               </w:rPr>
               <w:t xml:space="preserve"> for header in </w:t>
             </w:r>
-            <w:proofErr w:type="spellStart"/>
             <w:proofErr w:type="gramStart"/>
             <w:r>
               <w:rPr>
@@ -3988,17 +2983,7 @@
                 <w:sz w:val="20"/>
                 <w:lang w:val="en-US"/>
               </w:rPr>
-              <w:t>_headers</w:t>
-            </w:r>
-            <w:proofErr w:type="spellEnd"/>
-            <w:r>
-              <w:rPr>
-                <w:b/>
-                <w:spacing w:val="-5"/>
-                <w:sz w:val="20"/>
-                <w:lang w:val="en-US"/>
-              </w:rPr>
-              <w:t xml:space="preserve"> %}</w:t>
+              <w:t>_headers %}</w:t>
             </w:r>
           </w:p>
         </w:tc>
@@ -4025,18 +3010,8 @@
                 <w:spacing w:val="-5"/>
                 <w:sz w:val="20"/>
               </w:rPr>
-              <w:t xml:space="preserve">{{ </w:t>
-            </w:r>
-            <w:proofErr w:type="spellStart"/>
-            <w:r>
-              <w:rPr>
-                <w:b/>
-                <w:spacing w:val="-5"/>
-                <w:sz w:val="20"/>
-              </w:rPr>
-              <w:t>header</w:t>
-            </w:r>
-            <w:proofErr w:type="spellEnd"/>
+              <w:t>{{ header</w:t>
+            </w:r>
             <w:proofErr w:type="gramEnd"/>
             <w:r>
               <w:rPr>
@@ -4050,7 +3025,7 @@
         </w:tc>
         <w:tc>
           <w:tcPr>
-            <w:tcW w:w="993" w:type="dxa"/>
+            <w:tcW w:w="1135" w:type="dxa"/>
             <w:vAlign w:val="center"/>
           </w:tcPr>
           <w:p>
@@ -4087,25 +3062,7 @@
                 <w:spacing w:val="-5"/>
                 <w:sz w:val="20"/>
               </w:rPr>
-              <w:t xml:space="preserve"> </w:t>
-            </w:r>
-            <w:proofErr w:type="spellStart"/>
-            <w:r>
-              <w:rPr>
-                <w:b/>
-                <w:spacing w:val="-5"/>
-                <w:sz w:val="20"/>
-              </w:rPr>
-              <w:t>endfor</w:t>
-            </w:r>
-            <w:proofErr w:type="spellEnd"/>
-            <w:r>
-              <w:rPr>
-                <w:b/>
-                <w:spacing w:val="-5"/>
-                <w:sz w:val="20"/>
-              </w:rPr>
-              <w:t xml:space="preserve"> %}</w:t>
+              <w:t xml:space="preserve"> endfor %}</w:t>
             </w:r>
           </w:p>
         </w:tc>
@@ -4117,7 +3074,7 @@
         <w:tc>
           <w:tcPr>
             <w:tcW w:w="9325" w:type="dxa"/>
-            <w:gridSpan w:val="6"/>
+            <w:gridSpan w:val="5"/>
             <w:shd w:val="clear" w:color="auto" w:fill="FFFFFF" w:themeFill="background1"/>
           </w:tcPr>
           <w:p>
@@ -4150,7 +3107,6 @@
               </w:rPr>
               <w:t xml:space="preserve"> for disc in </w:t>
             </w:r>
-            <w:proofErr w:type="spellStart"/>
             <w:proofErr w:type="gramStart"/>
             <w:r>
               <w:rPr>
@@ -4175,7 +3131,6 @@
               </w:rPr>
               <w:t>distribution.disciplines</w:t>
             </w:r>
-            <w:proofErr w:type="spellEnd"/>
             <w:proofErr w:type="gramEnd"/>
             <w:r>
               <w:rPr>
@@ -4189,8 +3144,6 @@
       </w:tr>
       <w:tr>
         <w:trPr>
-          <w:gridAfter w:val="1"/>
-          <w:wAfter w:w="142" w:type="dxa"/>
           <w:trHeight w:val="688"/>
         </w:trPr>
         <w:tc>
@@ -4215,34 +3168,16 @@
                 <w:sz w:val="20"/>
                 <w:lang w:val="en-US"/>
               </w:rPr>
-              <w:t xml:space="preserve">{{ </w:t>
-            </w:r>
-            <w:proofErr w:type="spellStart"/>
+              <w:t>{{ disc</w:t>
+            </w:r>
+            <w:proofErr w:type="gramEnd"/>
             <w:r>
               <w:rPr>
                 <w:spacing w:val="-2"/>
                 <w:sz w:val="20"/>
                 <w:lang w:val="en-US"/>
               </w:rPr>
-              <w:t>disc</w:t>
-            </w:r>
-            <w:proofErr w:type="gramEnd"/>
-            <w:r>
-              <w:rPr>
-                <w:spacing w:val="-2"/>
-                <w:sz w:val="20"/>
-                <w:lang w:val="en-US"/>
-              </w:rPr>
-              <w:t>.discipline_index</w:t>
-            </w:r>
-            <w:proofErr w:type="spellEnd"/>
-            <w:r>
-              <w:rPr>
-                <w:spacing w:val="-2"/>
-                <w:sz w:val="20"/>
-                <w:lang w:val="en-US"/>
-              </w:rPr>
-              <w:t xml:space="preserve"> }}</w:t>
+              <w:t>.discipline_index }}</w:t>
             </w:r>
           </w:p>
         </w:tc>
@@ -4268,15 +3203,7 @@
                 <w:sz w:val="20"/>
                 <w:lang w:val="en-US"/>
               </w:rPr>
-              <w:t xml:space="preserve">{{ </w:t>
-            </w:r>
-            <w:proofErr w:type="spellStart"/>
-            <w:r>
-              <w:rPr>
-                <w:sz w:val="20"/>
-                <w:lang w:val="en-US"/>
-              </w:rPr>
-              <w:t>disc</w:t>
+              <w:t>{{ disc</w:t>
             </w:r>
             <w:proofErr w:type="gramEnd"/>
             <w:r>
@@ -4284,15 +3211,7 @@
                 <w:sz w:val="20"/>
                 <w:lang w:val="en-US"/>
               </w:rPr>
-              <w:t>.discipline_name</w:t>
-            </w:r>
-            <w:proofErr w:type="spellEnd"/>
-            <w:r>
-              <w:rPr>
-                <w:sz w:val="20"/>
-                <w:lang w:val="en-US"/>
-              </w:rPr>
-              <w:t xml:space="preserve"> }}</w:t>
+              <w:t>.discipline_name }}</w:t>
             </w:r>
           </w:p>
         </w:tc>
@@ -4334,53 +3253,25 @@
                 <w:sz w:val="20"/>
                 <w:lang w:val="en-US"/>
               </w:rPr>
-              <w:t xml:space="preserve"> for </w:t>
-            </w:r>
-            <w:proofErr w:type="spellStart"/>
+              <w:t xml:space="preserve"> for val in </w:t>
+            </w:r>
+            <w:proofErr w:type="gramStart"/>
             <w:r>
               <w:rPr>
                 <w:spacing w:val="-10"/>
                 <w:sz w:val="20"/>
                 <w:lang w:val="en-US"/>
               </w:rPr>
-              <w:t>val</w:t>
-            </w:r>
-            <w:proofErr w:type="spellEnd"/>
+              <w:t>disc.indicator</w:t>
+            </w:r>
+            <w:proofErr w:type="gramEnd"/>
             <w:r>
               <w:rPr>
                 <w:spacing w:val="-10"/>
                 <w:sz w:val="20"/>
                 <w:lang w:val="en-US"/>
               </w:rPr>
-              <w:t xml:space="preserve"> in </w:t>
-            </w:r>
-            <w:proofErr w:type="spellStart"/>
-            <w:proofErr w:type="gramStart"/>
-            <w:r>
-              <w:rPr>
-                <w:spacing w:val="-10"/>
-                <w:sz w:val="20"/>
-                <w:lang w:val="en-US"/>
-              </w:rPr>
-              <w:t>disc.indicator</w:t>
-            </w:r>
-            <w:proofErr w:type="gramEnd"/>
-            <w:r>
-              <w:rPr>
-                <w:spacing w:val="-10"/>
-                <w:sz w:val="20"/>
-                <w:lang w:val="en-US"/>
-              </w:rPr>
-              <w:t>_row</w:t>
-            </w:r>
-            <w:proofErr w:type="spellEnd"/>
-            <w:r>
-              <w:rPr>
-                <w:spacing w:val="-10"/>
-                <w:sz w:val="20"/>
-                <w:lang w:val="en-US"/>
-              </w:rPr>
-              <w:t xml:space="preserve"> %}</w:t>
+              <w:t>_row %}</w:t>
             </w:r>
           </w:p>
         </w:tc>
@@ -4407,18 +3298,8 @@
                 <w:sz w:val="20"/>
                 <w:lang w:val="en-US"/>
               </w:rPr>
-              <w:t xml:space="preserve">{{ </w:t>
-            </w:r>
-            <w:proofErr w:type="spellStart"/>
-            <w:r>
-              <w:rPr>
-                <w:spacing w:val="-10"/>
-                <w:sz w:val="20"/>
-                <w:lang w:val="en-US"/>
-              </w:rPr>
-              <w:t>val</w:t>
-            </w:r>
-            <w:proofErr w:type="spellEnd"/>
+              <w:t>{{ val</w:t>
+            </w:r>
             <w:proofErr w:type="gramEnd"/>
             <w:r>
               <w:rPr>
@@ -4432,7 +3313,7 @@
         </w:tc>
         <w:tc>
           <w:tcPr>
-            <w:tcW w:w="993" w:type="dxa"/>
+            <w:tcW w:w="1135" w:type="dxa"/>
             <w:shd w:val="clear" w:color="auto" w:fill="FFFFFF" w:themeFill="background1"/>
             <w:vAlign w:val="center"/>
           </w:tcPr>
@@ -4464,23 +3345,7 @@
                 <w:sz w:val="20"/>
                 <w:lang w:val="en-US"/>
               </w:rPr>
-              <w:t xml:space="preserve"> </w:t>
-            </w:r>
-            <w:proofErr w:type="spellStart"/>
-            <w:r>
-              <w:rPr>
-                <w:sz w:val="20"/>
-                <w:lang w:val="en-US"/>
-              </w:rPr>
-              <w:t>endfor</w:t>
-            </w:r>
-            <w:proofErr w:type="spellEnd"/>
-            <w:r>
-              <w:rPr>
-                <w:sz w:val="20"/>
-                <w:lang w:val="en-US"/>
-              </w:rPr>
-              <w:t xml:space="preserve"> %}</w:t>
+              <w:t xml:space="preserve"> endfor %}</w:t>
             </w:r>
           </w:p>
         </w:tc>
@@ -4492,7 +3357,7 @@
         <w:tc>
           <w:tcPr>
             <w:tcW w:w="9325" w:type="dxa"/>
-            <w:gridSpan w:val="6"/>
+            <w:gridSpan w:val="5"/>
             <w:shd w:val="clear" w:color="auto" w:fill="FFFFFF" w:themeFill="background1"/>
           </w:tcPr>
           <w:p>
@@ -4508,39 +3373,7 @@
                 <w:spacing w:val="-2"/>
                 <w:sz w:val="20"/>
               </w:rPr>
-              <w:t>{%</w:t>
-            </w:r>
-            <w:proofErr w:type="spellStart"/>
-            <w:r>
-              <w:rPr>
-                <w:spacing w:val="-2"/>
-                <w:sz w:val="20"/>
-              </w:rPr>
-              <w:t>tr</w:t>
-            </w:r>
-            <w:proofErr w:type="spellEnd"/>
-            <w:r>
-              <w:rPr>
-                <w:spacing w:val="-2"/>
-                <w:sz w:val="20"/>
-              </w:rPr>
-              <w:t xml:space="preserve"> </w:t>
-            </w:r>
-            <w:proofErr w:type="spellStart"/>
-            <w:r>
-              <w:rPr>
-                <w:spacing w:val="-2"/>
-                <w:sz w:val="20"/>
-              </w:rPr>
-              <w:t>endfor</w:t>
-            </w:r>
-            <w:proofErr w:type="spellEnd"/>
-            <w:r>
-              <w:rPr>
-                <w:spacing w:val="-2"/>
-                <w:sz w:val="20"/>
-              </w:rPr>
-              <w:t xml:space="preserve"> %}</w:t>
+              <w:t>{%tr endfor %}</w:t>
             </w:r>
           </w:p>
         </w:tc>
@@ -4711,6 +3544,7 @@
                 <w:spacing w:val="-10"/>
                 <w:sz w:val="20"/>
               </w:rPr>
+              <w:lastRenderedPageBreak/>
               <w:t>№</w:t>
             </w:r>
           </w:p>
@@ -4864,53 +3698,25 @@
                 <w:sz w:val="20"/>
                 <w:lang w:val="en-US"/>
               </w:rPr>
-              <w:t xml:space="preserve">{%tr for </w:t>
-            </w:r>
-            <w:proofErr w:type="spellStart"/>
+              <w:t xml:space="preserve">{%tr for ind in </w:t>
+            </w:r>
+            <w:proofErr w:type="gramStart"/>
             <w:r>
               <w:rPr>
                 <w:bCs/>
                 <w:sz w:val="20"/>
                 <w:lang w:val="en-US"/>
               </w:rPr>
-              <w:t>ind</w:t>
-            </w:r>
-            <w:proofErr w:type="spellEnd"/>
+              <w:t>item.indicator</w:t>
+            </w:r>
+            <w:proofErr w:type="gramEnd"/>
             <w:r>
               <w:rPr>
                 <w:bCs/>
                 <w:sz w:val="20"/>
                 <w:lang w:val="en-US"/>
               </w:rPr>
-              <w:t xml:space="preserve"> in </w:t>
-            </w:r>
-            <w:proofErr w:type="spellStart"/>
-            <w:proofErr w:type="gramStart"/>
-            <w:r>
-              <w:rPr>
-                <w:bCs/>
-                <w:sz w:val="20"/>
-                <w:lang w:val="en-US"/>
-              </w:rPr>
-              <w:t>item.indicator</w:t>
-            </w:r>
-            <w:proofErr w:type="gramEnd"/>
-            <w:r>
-              <w:rPr>
-                <w:bCs/>
-                <w:sz w:val="20"/>
-                <w:lang w:val="en-US"/>
-              </w:rPr>
-              <w:t>_list</w:t>
-            </w:r>
-            <w:proofErr w:type="spellEnd"/>
-            <w:r>
-              <w:rPr>
-                <w:bCs/>
-                <w:sz w:val="20"/>
-                <w:lang w:val="en-US"/>
-              </w:rPr>
-              <w:t xml:space="preserve"> %}</w:t>
+              <w:t>_list %}</w:t>
             </w:r>
           </w:p>
         </w:tc>
@@ -4939,31 +3745,15 @@
                 <w:spacing w:val="-10"/>
                 <w:sz w:val="20"/>
               </w:rPr>
-              <w:t xml:space="preserve">{{ </w:t>
-            </w:r>
-            <w:proofErr w:type="spellStart"/>
+              <w:t>{{ loop</w:t>
+            </w:r>
+            <w:proofErr w:type="gramEnd"/>
             <w:r>
               <w:rPr>
                 <w:spacing w:val="-10"/>
                 <w:sz w:val="20"/>
               </w:rPr>
-              <w:t>loop</w:t>
-            </w:r>
-            <w:proofErr w:type="gramEnd"/>
-            <w:r>
-              <w:rPr>
-                <w:spacing w:val="-10"/>
-                <w:sz w:val="20"/>
-              </w:rPr>
-              <w:t>.index</w:t>
-            </w:r>
-            <w:proofErr w:type="spellEnd"/>
-            <w:r>
-              <w:rPr>
-                <w:spacing w:val="-10"/>
-                <w:sz w:val="20"/>
-              </w:rPr>
-              <w:t xml:space="preserve"> }}</w:t>
+              <w:t>.index }}</w:t>
             </w:r>
           </w:p>
         </w:tc>
@@ -4987,28 +3777,14 @@
               <w:rPr>
                 <w:sz w:val="20"/>
               </w:rPr>
-              <w:t xml:space="preserve">{{ </w:t>
-            </w:r>
-            <w:proofErr w:type="spellStart"/>
-            <w:r>
-              <w:rPr>
-                <w:sz w:val="20"/>
-              </w:rPr>
-              <w:t>ind</w:t>
+              <w:t>{{ ind</w:t>
             </w:r>
             <w:proofErr w:type="gramEnd"/>
             <w:r>
               <w:rPr>
                 <w:sz w:val="20"/>
               </w:rPr>
-              <w:t>.discipline_name</w:t>
-            </w:r>
-            <w:proofErr w:type="spellEnd"/>
-            <w:r>
-              <w:rPr>
-                <w:sz w:val="20"/>
-              </w:rPr>
-              <w:t xml:space="preserve"> }}</w:t>
+              <w:t>.discipline_name }}</w:t>
             </w:r>
           </w:p>
         </w:tc>
@@ -5031,28 +3807,14 @@
               <w:rPr>
                 <w:sz w:val="20"/>
               </w:rPr>
-              <w:t xml:space="preserve">{{ </w:t>
-            </w:r>
-            <w:proofErr w:type="spellStart"/>
-            <w:r>
-              <w:rPr>
-                <w:sz w:val="20"/>
-              </w:rPr>
-              <w:t>ind</w:t>
+              <w:t>{{ ind</w:t>
             </w:r>
             <w:proofErr w:type="gramEnd"/>
             <w:r>
               <w:rPr>
                 <w:sz w:val="20"/>
               </w:rPr>
-              <w:t>.indicator_index</w:t>
-            </w:r>
-            <w:proofErr w:type="spellEnd"/>
-            <w:r>
-              <w:rPr>
-                <w:sz w:val="20"/>
-              </w:rPr>
-              <w:t xml:space="preserve"> }}</w:t>
+              <w:t>.indicator_index }}</w:t>
             </w:r>
           </w:p>
         </w:tc>
@@ -5087,16 +3849,8 @@
               <w:rPr>
                 <w:sz w:val="20"/>
               </w:rPr>
-              <w:t xml:space="preserve">{{ </w:t>
-            </w:r>
-            <w:proofErr w:type="spellStart"/>
-            <w:r>
-              <w:rPr>
-                <w:sz w:val="20"/>
-              </w:rPr>
-              <w:t>ind</w:t>
-            </w:r>
-            <w:proofErr w:type="spellEnd"/>
+              <w:t>{{ ind</w:t>
+            </w:r>
             <w:proofErr w:type="gramEnd"/>
             <w:r>
               <w:rPr>
@@ -5152,16 +3906,8 @@
               <w:rPr>
                 <w:sz w:val="20"/>
               </w:rPr>
-              <w:t xml:space="preserve">{{ </w:t>
-            </w:r>
-            <w:proofErr w:type="spellStart"/>
-            <w:r>
-              <w:rPr>
-                <w:sz w:val="20"/>
-              </w:rPr>
-              <w:t>ind</w:t>
-            </w:r>
-            <w:proofErr w:type="spellEnd"/>
+              <w:t>{{ ind</w:t>
+            </w:r>
             <w:proofErr w:type="gramEnd"/>
             <w:r>
               <w:rPr>
@@ -5225,21 +3971,7 @@
               <w:rPr>
                 <w:sz w:val="20"/>
               </w:rPr>
-              <w:t xml:space="preserve">{{ </w:t>
-            </w:r>
-            <w:proofErr w:type="spellStart"/>
-            <w:r>
-              <w:rPr>
-                <w:sz w:val="20"/>
-              </w:rPr>
-              <w:t>ind</w:t>
-            </w:r>
-            <w:proofErr w:type="spellEnd"/>
-            <w:r>
-              <w:rPr>
-                <w:sz w:val="20"/>
-              </w:rPr>
-              <w:t>.</w:t>
+              <w:t>{{ ind.</w:t>
             </w:r>
             <w:r>
               <w:rPr>
@@ -5281,35 +4013,7 @@
               <w:rPr>
                 <w:sz w:val="20"/>
               </w:rPr>
-              <w:t>{%</w:t>
-            </w:r>
-            <w:proofErr w:type="spellStart"/>
-            <w:r>
-              <w:rPr>
-                <w:sz w:val="20"/>
-              </w:rPr>
-              <w:t>tr</w:t>
-            </w:r>
-            <w:proofErr w:type="spellEnd"/>
-            <w:r>
-              <w:rPr>
-                <w:sz w:val="20"/>
-              </w:rPr>
-              <w:t xml:space="preserve"> </w:t>
-            </w:r>
-            <w:proofErr w:type="spellStart"/>
-            <w:r>
-              <w:rPr>
-                <w:sz w:val="20"/>
-              </w:rPr>
-              <w:t>endfor</w:t>
-            </w:r>
-            <w:proofErr w:type="spellEnd"/>
-            <w:r>
-              <w:rPr>
-                <w:sz w:val="20"/>
-              </w:rPr>
-              <w:t xml:space="preserve"> %</w:t>
+              <w:t>{%tr endfor %</w:t>
             </w:r>
             <w:r>
               <w:rPr>
@@ -5485,7 +4189,6 @@
                 <w:b/>
                 <w:sz w:val="20"/>
               </w:rPr>
-              <w:lastRenderedPageBreak/>
               <w:t>Индикатор</w:t>
             </w:r>
             <w:r>
@@ -5653,53 +4356,25 @@
                 <w:sz w:val="20"/>
                 <w:lang w:val="en-US"/>
               </w:rPr>
-              <w:t xml:space="preserve">{%tr for </w:t>
-            </w:r>
-            <w:proofErr w:type="spellStart"/>
+              <w:t xml:space="preserve">{%tr for ind in </w:t>
+            </w:r>
+            <w:proofErr w:type="gramStart"/>
             <w:r>
               <w:rPr>
                 <w:bCs/>
                 <w:sz w:val="20"/>
                 <w:lang w:val="en-US"/>
               </w:rPr>
-              <w:t>ind</w:t>
-            </w:r>
-            <w:proofErr w:type="spellEnd"/>
+              <w:t>item.indicator</w:t>
+            </w:r>
+            <w:proofErr w:type="gramEnd"/>
             <w:r>
               <w:rPr>
                 <w:bCs/>
                 <w:sz w:val="20"/>
                 <w:lang w:val="en-US"/>
               </w:rPr>
-              <w:t xml:space="preserve"> in </w:t>
-            </w:r>
-            <w:proofErr w:type="spellStart"/>
-            <w:proofErr w:type="gramStart"/>
-            <w:r>
-              <w:rPr>
-                <w:bCs/>
-                <w:sz w:val="20"/>
-                <w:lang w:val="en-US"/>
-              </w:rPr>
-              <w:t>item.indicator</w:t>
-            </w:r>
-            <w:proofErr w:type="gramEnd"/>
-            <w:r>
-              <w:rPr>
-                <w:bCs/>
-                <w:sz w:val="20"/>
-                <w:lang w:val="en-US"/>
-              </w:rPr>
-              <w:t>_list</w:t>
-            </w:r>
-            <w:proofErr w:type="spellEnd"/>
-            <w:r>
-              <w:rPr>
-                <w:bCs/>
-                <w:sz w:val="20"/>
-                <w:lang w:val="en-US"/>
-              </w:rPr>
-              <w:t xml:space="preserve"> %}</w:t>
+              <w:t>_list %}</w:t>
             </w:r>
           </w:p>
         </w:tc>
@@ -5718,7 +4393,6 @@
               <w:pStyle w:val="TableParagraph"/>
               <w:spacing w:line="228" w:lineRule="exact"/>
               <w:ind w:left="66"/>
-              <w:jc w:val="both"/>
               <w:rPr>
                 <w:sz w:val="20"/>
                 <w:lang w:val="en-US"/>
@@ -5730,15 +4404,7 @@
                 <w:sz w:val="20"/>
                 <w:lang w:val="en-US"/>
               </w:rPr>
-              <w:t xml:space="preserve">{{ </w:t>
-            </w:r>
-            <w:proofErr w:type="spellStart"/>
-            <w:r>
-              <w:rPr>
-                <w:sz w:val="20"/>
-                <w:lang w:val="en-US"/>
-              </w:rPr>
-              <w:t>ind</w:t>
+              <w:t>{{ ind</w:t>
             </w:r>
             <w:proofErr w:type="gramEnd"/>
             <w:r>
@@ -5754,15 +4420,7 @@
                 <w:sz w:val="20"/>
                 <w:lang w:val="en-US"/>
               </w:rPr>
-              <w:t>index</w:t>
-            </w:r>
-            <w:proofErr w:type="spellEnd"/>
-            <w:r>
-              <w:rPr>
-                <w:sz w:val="20"/>
-                <w:lang w:val="en-US"/>
-              </w:rPr>
-              <w:t xml:space="preserve"> }</w:t>
+              <w:t>index }</w:t>
             </w:r>
             <w:proofErr w:type="gramEnd"/>
             <w:r>
@@ -5786,34 +4444,16 @@
                 <w:sz w:val="20"/>
                 <w:lang w:val="en-US"/>
               </w:rPr>
-              <w:t xml:space="preserve">{{ </w:t>
-            </w:r>
-            <w:proofErr w:type="spellStart"/>
+              <w:t>{{ ind</w:t>
+            </w:r>
+            <w:proofErr w:type="gramEnd"/>
             <w:r>
               <w:rPr>
                 <w:spacing w:val="-2"/>
                 <w:sz w:val="20"/>
                 <w:lang w:val="en-US"/>
               </w:rPr>
-              <w:t>ind</w:t>
-            </w:r>
-            <w:proofErr w:type="gramEnd"/>
-            <w:r>
-              <w:rPr>
-                <w:spacing w:val="-2"/>
-                <w:sz w:val="20"/>
-                <w:lang w:val="en-US"/>
-              </w:rPr>
-              <w:t>.indicator</w:t>
-            </w:r>
-            <w:proofErr w:type="spellEnd"/>
-            <w:r>
-              <w:rPr>
-                <w:spacing w:val="-2"/>
-                <w:sz w:val="20"/>
-                <w:lang w:val="en-US"/>
-              </w:rPr>
-              <w:t xml:space="preserve"> }}</w:t>
+              <w:t>.indicator }}</w:t>
             </w:r>
           </w:p>
         </w:tc>
@@ -5836,16 +4476,8 @@
               <w:rPr>
                 <w:sz w:val="20"/>
               </w:rPr>
-              <w:t xml:space="preserve">{{ </w:t>
-            </w:r>
-            <w:proofErr w:type="spellStart"/>
-            <w:r>
-              <w:rPr>
-                <w:sz w:val="20"/>
-              </w:rPr>
-              <w:t>ind</w:t>
-            </w:r>
-            <w:proofErr w:type="spellEnd"/>
+              <w:t>{{ ind</w:t>
+            </w:r>
             <w:proofErr w:type="gramEnd"/>
             <w:r>
               <w:rPr>
@@ -5887,16 +4519,8 @@
               <w:rPr>
                 <w:sz w:val="20"/>
               </w:rPr>
-              <w:t xml:space="preserve">{{ </w:t>
-            </w:r>
-            <w:proofErr w:type="spellStart"/>
-            <w:r>
-              <w:rPr>
-                <w:sz w:val="20"/>
-              </w:rPr>
-              <w:t>ind</w:t>
-            </w:r>
-            <w:proofErr w:type="spellEnd"/>
+              <w:t>{{ ind</w:t>
+            </w:r>
             <w:proofErr w:type="gramEnd"/>
             <w:r>
               <w:rPr>
@@ -5942,35 +4566,7 @@
               <w:rPr>
                 <w:sz w:val="20"/>
               </w:rPr>
-              <w:t>{%</w:t>
-            </w:r>
-            <w:proofErr w:type="spellStart"/>
-            <w:r>
-              <w:rPr>
-                <w:sz w:val="20"/>
-              </w:rPr>
-              <w:t>tr</w:t>
-            </w:r>
-            <w:proofErr w:type="spellEnd"/>
-            <w:r>
-              <w:rPr>
-                <w:sz w:val="20"/>
-              </w:rPr>
-              <w:t xml:space="preserve"> </w:t>
-            </w:r>
-            <w:proofErr w:type="spellStart"/>
-            <w:r>
-              <w:rPr>
-                <w:sz w:val="20"/>
-              </w:rPr>
-              <w:t>endfor</w:t>
-            </w:r>
-            <w:proofErr w:type="spellEnd"/>
-            <w:r>
-              <w:rPr>
-                <w:sz w:val="20"/>
-              </w:rPr>
-              <w:t xml:space="preserve"> %</w:t>
+              <w:t>{%tr endfor %</w:t>
             </w:r>
             <w:r>
               <w:rPr>
@@ -6005,21 +4601,7 @@
           <w:lang w:val="en-US"/>
         </w:rPr>
         <w:lastRenderedPageBreak/>
-        <w:t xml:space="preserve">{% </w:t>
-      </w:r>
-      <w:proofErr w:type="spellStart"/>
-      <w:r>
-        <w:rPr>
-          <w:lang w:val="en-US"/>
-        </w:rPr>
-        <w:t>endfor</w:t>
-      </w:r>
-      <w:proofErr w:type="spellEnd"/>
-      <w:r>
-        <w:rPr>
-          <w:lang w:val="en-US"/>
-        </w:rPr>
-        <w:t xml:space="preserve"> -%}</w:t>
+        <w:t>{% endfor -%}</w:t>
       </w:r>
     </w:p>
     <w:sectPr>

</xml_diff>

<commit_message>
templates have been improved
</commit_message>
<xml_diff>
--- a/templates/docxRPD/passport.docx
+++ b/templates/docxRPD/passport.docx
@@ -294,7 +294,15 @@
           <w:sz w:val="24"/>
           <w:szCs w:val="24"/>
         </w:rPr>
-        <w:t>{{ direction</w:t>
+        <w:t xml:space="preserve">{{ </w:t>
+      </w:r>
+      <w:proofErr w:type="spellStart"/>
+      <w:r>
+        <w:rPr>
+          <w:sz w:val="24"/>
+          <w:szCs w:val="24"/>
+        </w:rPr>
+        <w:t>direction</w:t>
       </w:r>
       <w:proofErr w:type="gramEnd"/>
       <w:r>
@@ -310,7 +318,15 @@
           <w:sz w:val="24"/>
           <w:szCs w:val="24"/>
         </w:rPr>
-        <w:t>code }</w:t>
+        <w:t>code</w:t>
+      </w:r>
+      <w:proofErr w:type="spellEnd"/>
+      <w:r>
+        <w:rPr>
+          <w:sz w:val="24"/>
+          <w:szCs w:val="24"/>
+        </w:rPr>
+        <w:t xml:space="preserve"> }</w:t>
       </w:r>
       <w:proofErr w:type="gramEnd"/>
       <w:r>
@@ -326,8 +342,17 @@
           <w:sz w:val="24"/>
           <w:szCs w:val="24"/>
         </w:rPr>
-        <w:t>{{ direction</w:t>
-      </w:r>
+        <w:t xml:space="preserve">{{ </w:t>
+      </w:r>
+      <w:proofErr w:type="spellStart"/>
+      <w:r>
+        <w:rPr>
+          <w:sz w:val="24"/>
+          <w:szCs w:val="24"/>
+        </w:rPr>
+        <w:t>direction</w:t>
+      </w:r>
+      <w:proofErr w:type="spellEnd"/>
       <w:proofErr w:type="gramEnd"/>
       <w:r>
         <w:rPr>
@@ -713,8 +738,17 @@
           <w:spacing w:val="-2"/>
           <w:sz w:val="24"/>
         </w:rPr>
-        <w:t>{{ kvalif</w:t>
-      </w:r>
+        <w:t xml:space="preserve">{{ </w:t>
+      </w:r>
+      <w:proofErr w:type="spellStart"/>
+      <w:r>
+        <w:rPr>
+          <w:spacing w:val="-2"/>
+          <w:sz w:val="24"/>
+        </w:rPr>
+        <w:t>kvalif</w:t>
+      </w:r>
+      <w:proofErr w:type="spellEnd"/>
       <w:proofErr w:type="gramEnd"/>
       <w:r>
         <w:rPr>
@@ -1021,7 +1055,15 @@
           <w:spacing w:val="-4"/>
           <w:sz w:val="24"/>
         </w:rPr>
-        <w:t>{{ year</w:t>
+        <w:t xml:space="preserve">{{ </w:t>
+      </w:r>
+      <w:proofErr w:type="spellStart"/>
+      <w:r>
+        <w:rPr>
+          <w:spacing w:val="-4"/>
+          <w:sz w:val="24"/>
+        </w:rPr>
+        <w:t>year</w:t>
       </w:r>
       <w:proofErr w:type="gramEnd"/>
       <w:r>
@@ -1037,7 +1079,15 @@
           <w:spacing w:val="-4"/>
           <w:sz w:val="24"/>
         </w:rPr>
-        <w:t>post }</w:t>
+        <w:t>post</w:t>
+      </w:r>
+      <w:proofErr w:type="spellEnd"/>
+      <w:r>
+        <w:rPr>
+          <w:spacing w:val="-4"/>
+          <w:sz w:val="24"/>
+        </w:rPr>
+        <w:t xml:space="preserve"> }</w:t>
       </w:r>
       <w:proofErr w:type="gramEnd"/>
       <w:r>
@@ -1108,7 +1158,11 @@
       </w:r>
       <w:proofErr w:type="gramStart"/>
       <w:r>
-        <w:t>{{ protocol</w:t>
+        <w:t xml:space="preserve">{{ </w:t>
+      </w:r>
+      <w:proofErr w:type="spellStart"/>
+      <w:r>
+        <w:t>protocol</w:t>
       </w:r>
       <w:proofErr w:type="gramEnd"/>
       <w:r>
@@ -1116,7 +1170,11 @@
       </w:r>
       <w:proofErr w:type="gramStart"/>
       <w:r>
-        <w:t>year }</w:t>
+        <w:t>year</w:t>
+      </w:r>
+      <w:proofErr w:type="spellEnd"/>
+      <w:r>
+        <w:t xml:space="preserve"> }</w:t>
       </w:r>
       <w:proofErr w:type="gramEnd"/>
       <w:r>
@@ -1179,7 +1237,14 @@
         <w:rPr>
           <w:lang w:val="en-US"/>
         </w:rPr>
-        <w:t>{{ item</w:t>
+        <w:t xml:space="preserve">{{ </w:t>
+      </w:r>
+      <w:proofErr w:type="spellStart"/>
+      <w:r>
+        <w:rPr>
+          <w:lang w:val="en-US"/>
+        </w:rPr>
+        <w:t>item</w:t>
       </w:r>
       <w:proofErr w:type="gramEnd"/>
       <w:r>
@@ -1193,7 +1258,14 @@
         <w:rPr>
           <w:lang w:val="en-US"/>
         </w:rPr>
-        <w:t>index }</w:t>
+        <w:t>index</w:t>
+      </w:r>
+      <w:proofErr w:type="spellEnd"/>
+      <w:r>
+        <w:rPr>
+          <w:lang w:val="en-US"/>
+        </w:rPr>
+        <w:t xml:space="preserve"> }</w:t>
       </w:r>
       <w:proofErr w:type="gramEnd"/>
       <w:r>
@@ -1215,6 +1287,7 @@
         </w:rPr>
         <w:t xml:space="preserve">{{ </w:t>
       </w:r>
+      <w:proofErr w:type="spellStart"/>
       <w:r>
         <w:rPr>
           <w:lang w:val="en-US"/>
@@ -1235,6 +1308,7 @@
         </w:rPr>
         <w:t>competence</w:t>
       </w:r>
+      <w:proofErr w:type="spellEnd"/>
       <w:r>
         <w:rPr>
           <w:lang w:val="en-US"/>
@@ -1405,7 +1479,15 @@
           <w:spacing w:val="-2"/>
           <w:sz w:val="24"/>
         </w:rPr>
-        <w:t>{{ item</w:t>
+        <w:t xml:space="preserve">{{ </w:t>
+      </w:r>
+      <w:proofErr w:type="spellStart"/>
+      <w:r>
+        <w:rPr>
+          <w:spacing w:val="-2"/>
+          <w:sz w:val="24"/>
+        </w:rPr>
+        <w:t>item</w:t>
       </w:r>
       <w:proofErr w:type="gramEnd"/>
       <w:r>
@@ -1421,7 +1503,15 @@
           <w:spacing w:val="-2"/>
           <w:sz w:val="24"/>
         </w:rPr>
-        <w:t>relations }</w:t>
+        <w:t>relations</w:t>
+      </w:r>
+      <w:proofErr w:type="spellEnd"/>
+      <w:r>
+        <w:rPr>
+          <w:spacing w:val="-2"/>
+          <w:sz w:val="24"/>
+        </w:rPr>
+        <w:t xml:space="preserve"> }</w:t>
       </w:r>
       <w:proofErr w:type="gramEnd"/>
       <w:r>
@@ -1538,11 +1628,11 @@
         <w:tblLook w:val="01E0" w:firstRow="1" w:lastRow="1" w:firstColumn="1" w:lastColumn="1" w:noHBand="0" w:noVBand="0"/>
       </w:tblPr>
       <w:tblGrid>
-        <w:gridCol w:w="1714"/>
-        <w:gridCol w:w="2705"/>
-        <w:gridCol w:w="511"/>
-        <w:gridCol w:w="583"/>
-        <w:gridCol w:w="551"/>
+        <w:gridCol w:w="1387"/>
+        <w:gridCol w:w="1984"/>
+        <w:gridCol w:w="709"/>
+        <w:gridCol w:w="709"/>
+        <w:gridCol w:w="708"/>
       </w:tblGrid>
       <w:tr>
         <w:trPr>
@@ -1550,7 +1640,8 @@
         </w:trPr>
         <w:tc>
           <w:tcPr>
-            <w:tcW w:w="1714" w:type="dxa"/>
+            <w:tcW w:w="1387" w:type="dxa"/>
+            <w:vMerge w:val="restart"/>
             <w:shd w:val="clear" w:color="auto" w:fill="FFFFFF" w:themeFill="background1"/>
           </w:tcPr>
           <w:p>
@@ -1558,6 +1649,7 @@
               <w:pStyle w:val="TableParagraph"/>
               <w:spacing w:before="116"/>
               <w:ind w:left="83"/>
+              <w:jc w:val="center"/>
               <w:rPr>
                 <w:b/>
                 <w:sz w:val="20"/>
@@ -1590,14 +1682,16 @@
         </w:tc>
         <w:tc>
           <w:tcPr>
-            <w:tcW w:w="2705" w:type="dxa"/>
+            <w:tcW w:w="1984" w:type="dxa"/>
+            <w:vMerge w:val="restart"/>
             <w:shd w:val="clear" w:color="auto" w:fill="FFFFFF" w:themeFill="background1"/>
           </w:tcPr>
           <w:p>
             <w:pPr>
               <w:pStyle w:val="TableParagraph"/>
               <w:spacing w:line="230" w:lineRule="atLeast"/>
-              <w:ind w:left="465" w:right="62" w:hanging="382"/>
+              <w:ind w:left="101" w:right="62"/>
+              <w:jc w:val="center"/>
               <w:rPr>
                 <w:b/>
                 <w:sz w:val="20"/>
@@ -1629,7 +1723,7 @@
         </w:tc>
         <w:tc>
           <w:tcPr>
-            <w:tcW w:w="511" w:type="dxa"/>
+            <w:tcW w:w="709" w:type="dxa"/>
             <w:shd w:val="clear" w:color="auto" w:fill="FFFFFF" w:themeFill="background1"/>
           </w:tcPr>
           <w:p>
@@ -1641,7 +1735,6 @@
               <w:rPr>
                 <w:b/>
                 <w:bCs/>
-                <w:sz w:val="20"/>
                 <w:lang w:val="en-US"/>
               </w:rPr>
             </w:pPr>
@@ -1651,13 +1744,85 @@
                 <w:bCs/>
                 <w:lang w:val="en-US"/>
               </w:rPr>
-              <w:t>{%- for sem in semester_headers %}</w:t>
+              <w:t>{%</w:t>
+            </w:r>
+            <w:proofErr w:type="spellStart"/>
+            <w:r>
+              <w:rPr>
+                <w:b/>
+                <w:bCs/>
+                <w:lang w:val="en-US"/>
+              </w:rPr>
+              <w:t>tc</w:t>
+            </w:r>
+            <w:proofErr w:type="spellEnd"/>
+            <w:r>
+              <w:rPr>
+                <w:b/>
+                <w:bCs/>
+                <w:lang w:val="en-US"/>
+              </w:rPr>
+              <w:t xml:space="preserve"> for </w:t>
+            </w:r>
+            <w:proofErr w:type="spellStart"/>
+            <w:r>
+              <w:rPr>
+                <w:b/>
+                <w:bCs/>
+                <w:lang w:val="en-US"/>
+              </w:rPr>
+              <w:t>sem</w:t>
+            </w:r>
+            <w:proofErr w:type="spellEnd"/>
+            <w:r>
+              <w:rPr>
+                <w:b/>
+                <w:bCs/>
+                <w:lang w:val="en-US"/>
+              </w:rPr>
+              <w:t xml:space="preserve"> in </w:t>
+            </w:r>
+            <w:proofErr w:type="gramStart"/>
+            <w:r>
+              <w:rPr>
+                <w:b/>
+                <w:bCs/>
+                <w:lang w:val="en-US"/>
+              </w:rPr>
+              <w:t>range(</w:t>
+            </w:r>
+            <w:proofErr w:type="gramEnd"/>
+            <w:r>
+              <w:rPr>
+                <w:b/>
+                <w:bCs/>
+                <w:lang w:val="en-US"/>
+              </w:rPr>
+              <w:t xml:space="preserve">1, </w:t>
+            </w:r>
+            <w:proofErr w:type="spellStart"/>
+            <w:r>
+              <w:rPr>
+                <w:b/>
+                <w:bCs/>
+                <w:lang w:val="en-US"/>
+              </w:rPr>
+              <w:t>semester_headers|count</w:t>
+            </w:r>
+            <w:proofErr w:type="spellEnd"/>
+            <w:r>
+              <w:rPr>
+                <w:b/>
+                <w:bCs/>
+                <w:lang w:val="en-US"/>
+              </w:rPr>
+              <w:t>//2+1) %}</w:t>
             </w:r>
           </w:p>
         </w:tc>
         <w:tc>
           <w:tcPr>
-            <w:tcW w:w="583" w:type="dxa"/>
+            <w:tcW w:w="709" w:type="dxa"/>
             <w:shd w:val="clear" w:color="auto" w:fill="FFFFFF" w:themeFill="background1"/>
           </w:tcPr>
           <w:p>
@@ -1669,30 +1834,61 @@
               <w:rPr>
                 <w:b/>
                 <w:bCs/>
-                <w:sz w:val="20"/>
               </w:rPr>
             </w:pPr>
+            <w:r>
+              <w:rPr>
+                <w:b/>
+                <w:bCs/>
+              </w:rPr>
+              <w:t xml:space="preserve">{% </w:t>
+            </w:r>
+            <w:proofErr w:type="spellStart"/>
+            <w:r>
+              <w:rPr>
+                <w:b/>
+                <w:bCs/>
+              </w:rPr>
+              <w:t>colspan</w:t>
+            </w:r>
+            <w:proofErr w:type="spellEnd"/>
+            <w:r>
+              <w:rPr>
+                <w:b/>
+                <w:bCs/>
+              </w:rPr>
+              <w:t xml:space="preserve"> </w:t>
+            </w:r>
             <w:proofErr w:type="gramStart"/>
             <w:r>
               <w:rPr>
                 <w:b/>
                 <w:bCs/>
               </w:rPr>
-              <w:t>{{ sem</w:t>
-            </w:r>
+              <w:t xml:space="preserve">2  %}{{ </w:t>
+            </w:r>
+            <w:proofErr w:type="spellStart"/>
+            <w:r>
+              <w:rPr>
+                <w:b/>
+                <w:bCs/>
+              </w:rPr>
+              <w:t>sem</w:t>
+            </w:r>
+            <w:proofErr w:type="spellEnd"/>
             <w:proofErr w:type="gramEnd"/>
             <w:r>
               <w:rPr>
                 <w:b/>
                 <w:bCs/>
               </w:rPr>
-              <w:t xml:space="preserve"> }} семестр</w:t>
+              <w:t xml:space="preserve"> }} курс</w:t>
             </w:r>
           </w:p>
         </w:tc>
         <w:tc>
           <w:tcPr>
-            <w:tcW w:w="551" w:type="dxa"/>
+            <w:tcW w:w="708" w:type="dxa"/>
             <w:shd w:val="clear" w:color="auto" w:fill="FFFFFF" w:themeFill="background1"/>
           </w:tcPr>
           <w:p>
@@ -1704,7 +1900,6 @@
               <w:rPr>
                 <w:b/>
                 <w:bCs/>
-                <w:sz w:val="20"/>
               </w:rPr>
             </w:pPr>
             <w:r>
@@ -1712,7 +1907,264 @@
                 <w:b/>
                 <w:bCs/>
               </w:rPr>
-              <w:t>{%- endfor %}</w:t>
+              <w:t>{%</w:t>
+            </w:r>
+            <w:proofErr w:type="spellStart"/>
+            <w:r>
+              <w:rPr>
+                <w:b/>
+                <w:bCs/>
+              </w:rPr>
+              <w:t>tc</w:t>
+            </w:r>
+            <w:proofErr w:type="spellEnd"/>
+            <w:r>
+              <w:rPr>
+                <w:b/>
+                <w:bCs/>
+              </w:rPr>
+              <w:t xml:space="preserve"> </w:t>
+            </w:r>
+            <w:proofErr w:type="spellStart"/>
+            <w:r>
+              <w:rPr>
+                <w:b/>
+                <w:bCs/>
+              </w:rPr>
+              <w:t>endfor</w:t>
+            </w:r>
+            <w:proofErr w:type="spellEnd"/>
+            <w:r>
+              <w:rPr>
+                <w:b/>
+                <w:bCs/>
+              </w:rPr>
+              <w:t xml:space="preserve"> %}</w:t>
+            </w:r>
+          </w:p>
+        </w:tc>
+      </w:tr>
+      <w:tr>
+        <w:trPr>
+          <w:trHeight w:val="467"/>
+        </w:trPr>
+        <w:tc>
+          <w:tcPr>
+            <w:tcW w:w="1387" w:type="dxa"/>
+            <w:vMerge/>
+            <w:shd w:val="clear" w:color="auto" w:fill="FFFFFF" w:themeFill="background1"/>
+          </w:tcPr>
+          <w:p>
+            <w:pPr>
+              <w:pStyle w:val="TableParagraph"/>
+              <w:spacing w:before="116"/>
+              <w:ind w:left="83"/>
+              <w:rPr>
+                <w:b/>
+                <w:sz w:val="20"/>
+              </w:rPr>
+            </w:pPr>
+          </w:p>
+        </w:tc>
+        <w:tc>
+          <w:tcPr>
+            <w:tcW w:w="1984" w:type="dxa"/>
+            <w:vMerge/>
+            <w:shd w:val="clear" w:color="auto" w:fill="FFFFFF" w:themeFill="background1"/>
+          </w:tcPr>
+          <w:p>
+            <w:pPr>
+              <w:pStyle w:val="TableParagraph"/>
+              <w:spacing w:line="230" w:lineRule="atLeast"/>
+              <w:ind w:left="465" w:right="62" w:hanging="382"/>
+              <w:rPr>
+                <w:b/>
+                <w:sz w:val="20"/>
+              </w:rPr>
+            </w:pPr>
+          </w:p>
+        </w:tc>
+        <w:tc>
+          <w:tcPr>
+            <w:tcW w:w="709" w:type="dxa"/>
+            <w:shd w:val="clear" w:color="auto" w:fill="FFFFFF" w:themeFill="background1"/>
+          </w:tcPr>
+          <w:p>
+            <w:pPr>
+              <w:pStyle w:val="TableParagraph"/>
+              <w:spacing w:line="205" w:lineRule="exact"/>
+              <w:ind w:left="21" w:right="7"/>
+              <w:jc w:val="center"/>
+              <w:rPr>
+                <w:b/>
+                <w:bCs/>
+                <w:sz w:val="20"/>
+                <w:lang w:val="en-US"/>
+              </w:rPr>
+            </w:pPr>
+            <w:r>
+              <w:rPr>
+                <w:b/>
+                <w:bCs/>
+                <w:lang w:val="en-US"/>
+              </w:rPr>
+              <w:t>{%</w:t>
+            </w:r>
+            <w:proofErr w:type="spellStart"/>
+            <w:r>
+              <w:rPr>
+                <w:b/>
+                <w:bCs/>
+                <w:lang w:val="en-US"/>
+              </w:rPr>
+              <w:t>tc</w:t>
+            </w:r>
+            <w:proofErr w:type="spellEnd"/>
+            <w:r>
+              <w:rPr>
+                <w:b/>
+                <w:bCs/>
+                <w:lang w:val="en-US"/>
+              </w:rPr>
+              <w:t xml:space="preserve"> for </w:t>
+            </w:r>
+            <w:proofErr w:type="spellStart"/>
+            <w:r>
+              <w:rPr>
+                <w:b/>
+                <w:bCs/>
+                <w:lang w:val="en-US"/>
+              </w:rPr>
+              <w:t>sem</w:t>
+            </w:r>
+            <w:proofErr w:type="spellEnd"/>
+            <w:r>
+              <w:rPr>
+                <w:b/>
+                <w:bCs/>
+                <w:lang w:val="en-US"/>
+              </w:rPr>
+              <w:t xml:space="preserve"> in </w:t>
+            </w:r>
+            <w:proofErr w:type="spellStart"/>
+            <w:r>
+              <w:rPr>
+                <w:b/>
+                <w:bCs/>
+                <w:lang w:val="en-US"/>
+              </w:rPr>
+              <w:t>semester_headers</w:t>
+            </w:r>
+            <w:proofErr w:type="spellEnd"/>
+            <w:r>
+              <w:rPr>
+                <w:b/>
+                <w:bCs/>
+                <w:lang w:val="en-US"/>
+              </w:rPr>
+              <w:t xml:space="preserve"> %}</w:t>
+            </w:r>
+          </w:p>
+        </w:tc>
+        <w:tc>
+          <w:tcPr>
+            <w:tcW w:w="709" w:type="dxa"/>
+            <w:shd w:val="clear" w:color="auto" w:fill="FFFFFF" w:themeFill="background1"/>
+          </w:tcPr>
+          <w:p>
+            <w:pPr>
+              <w:pStyle w:val="TableParagraph"/>
+              <w:spacing w:line="205" w:lineRule="exact"/>
+              <w:ind w:left="19"/>
+              <w:jc w:val="center"/>
+              <w:rPr>
+                <w:b/>
+                <w:bCs/>
+                <w:sz w:val="20"/>
+              </w:rPr>
+            </w:pPr>
+            <w:proofErr w:type="gramStart"/>
+            <w:r>
+              <w:rPr>
+                <w:b/>
+                <w:bCs/>
+              </w:rPr>
+              <w:t xml:space="preserve">{{ </w:t>
+            </w:r>
+            <w:proofErr w:type="spellStart"/>
+            <w:r>
+              <w:rPr>
+                <w:b/>
+                <w:bCs/>
+              </w:rPr>
+              <w:t>sem</w:t>
+            </w:r>
+            <w:proofErr w:type="spellEnd"/>
+            <w:proofErr w:type="gramEnd"/>
+            <w:r>
+              <w:rPr>
+                <w:b/>
+                <w:bCs/>
+              </w:rPr>
+              <w:t xml:space="preserve"> }} </w:t>
+            </w:r>
+          </w:p>
+        </w:tc>
+        <w:tc>
+          <w:tcPr>
+            <w:tcW w:w="708" w:type="dxa"/>
+            <w:shd w:val="clear" w:color="auto" w:fill="FFFFFF" w:themeFill="background1"/>
+          </w:tcPr>
+          <w:p>
+            <w:pPr>
+              <w:pStyle w:val="TableParagraph"/>
+              <w:spacing w:line="205" w:lineRule="exact"/>
+              <w:ind w:left="30" w:right="15"/>
+              <w:jc w:val="center"/>
+              <w:rPr>
+                <w:b/>
+                <w:bCs/>
+                <w:sz w:val="20"/>
+              </w:rPr>
+            </w:pPr>
+            <w:r>
+              <w:rPr>
+                <w:b/>
+                <w:bCs/>
+              </w:rPr>
+              <w:t>{%</w:t>
+            </w:r>
+            <w:proofErr w:type="spellStart"/>
+            <w:r>
+              <w:rPr>
+                <w:b/>
+                <w:bCs/>
+              </w:rPr>
+              <w:t>tc</w:t>
+            </w:r>
+            <w:proofErr w:type="spellEnd"/>
+            <w:r>
+              <w:rPr>
+                <w:b/>
+                <w:bCs/>
+              </w:rPr>
+              <w:t xml:space="preserve"> </w:t>
+            </w:r>
+            <w:proofErr w:type="spellStart"/>
+            <w:r>
+              <w:rPr>
+                <w:b/>
+                <w:bCs/>
+              </w:rPr>
+              <w:t>endfor</w:t>
+            </w:r>
+            <w:proofErr w:type="spellEnd"/>
+            <w:r>
+              <w:rPr>
+                <w:b/>
+                <w:bCs/>
+              </w:rPr>
+              <w:t xml:space="preserve"> %}</w:t>
             </w:r>
           </w:p>
         </w:tc>
@@ -1723,7 +2175,187 @@
         </w:trPr>
         <w:tc>
           <w:tcPr>
-            <w:tcW w:w="6064" w:type="dxa"/>
+            <w:tcW w:w="5497" w:type="dxa"/>
+            <w:gridSpan w:val="5"/>
+            <w:shd w:val="clear" w:color="auto" w:fill="FFFFFF" w:themeFill="background1"/>
+          </w:tcPr>
+          <w:p>
+            <w:pPr>
+              <w:pStyle w:val="TableParagraph"/>
+              <w:ind w:left="116" w:right="90"/>
+              <w:jc w:val="center"/>
+              <w:rPr>
+                <w:b/>
+                <w:sz w:val="20"/>
+                <w:lang w:val="en-US"/>
+              </w:rPr>
+            </w:pPr>
+            <w:r>
+              <w:rPr>
+                <w:sz w:val="24"/>
+                <w:szCs w:val="24"/>
+                <w:lang w:val="en-US"/>
+              </w:rPr>
+              <w:t xml:space="preserve">{% </w:t>
+            </w:r>
+            <w:proofErr w:type="spellStart"/>
+            <w:r>
+              <w:rPr>
+                <w:sz w:val="24"/>
+                <w:szCs w:val="24"/>
+                <w:lang w:val="en-US"/>
+              </w:rPr>
+              <w:t>colspan</w:t>
+            </w:r>
+            <w:proofErr w:type="spellEnd"/>
+            <w:r>
+              <w:rPr>
+                <w:sz w:val="24"/>
+                <w:szCs w:val="24"/>
+                <w:lang w:val="en-US"/>
+              </w:rPr>
+              <w:t xml:space="preserve"> </w:t>
+            </w:r>
+            <w:r>
+              <w:rPr>
+                <w:spacing w:val="-5"/>
+                <w:sz w:val="20"/>
+                <w:lang w:val="en-US"/>
+              </w:rPr>
+              <w:t>semester_headers</w:t>
+            </w:r>
+            <w:r>
+              <w:rPr>
+                <w:spacing w:val="-5"/>
+                <w:sz w:val="20"/>
+                <w:lang w:val="en-US"/>
+              </w:rPr>
+              <w:t>|count</w:t>
+            </w:r>
+            <w:r>
+              <w:rPr>
+                <w:spacing w:val="-5"/>
+                <w:sz w:val="20"/>
+                <w:lang w:val="en-US"/>
+              </w:rPr>
+              <w:t>+2</w:t>
+            </w:r>
+            <w:r>
+              <w:rPr>
+                <w:sz w:val="24"/>
+                <w:szCs w:val="24"/>
+                <w:lang w:val="en-US"/>
+              </w:rPr>
+              <w:t xml:space="preserve"> </w:t>
+            </w:r>
+            <w:proofErr w:type="gramStart"/>
+            <w:r>
+              <w:rPr>
+                <w:sz w:val="24"/>
+                <w:szCs w:val="24"/>
+                <w:lang w:val="en-US"/>
+              </w:rPr>
+              <w:t>%}</w:t>
+            </w:r>
+            <w:r>
+              <w:rPr>
+                <w:b/>
+                <w:sz w:val="20"/>
+                <w:lang w:val="en-US"/>
+              </w:rPr>
+              <w:t xml:space="preserve">{{ </w:t>
+            </w:r>
+            <w:proofErr w:type="spellStart"/>
+            <w:r>
+              <w:rPr>
+                <w:b/>
+                <w:sz w:val="20"/>
+                <w:lang w:val="en-US"/>
+              </w:rPr>
+              <w:t>item</w:t>
+            </w:r>
+            <w:proofErr w:type="gramEnd"/>
+            <w:r>
+              <w:rPr>
+                <w:b/>
+                <w:sz w:val="20"/>
+                <w:lang w:val="en-US"/>
+              </w:rPr>
+              <w:t>.competence_</w:t>
+            </w:r>
+            <w:proofErr w:type="gramStart"/>
+            <w:r>
+              <w:rPr>
+                <w:b/>
+                <w:sz w:val="20"/>
+                <w:lang w:val="en-US"/>
+              </w:rPr>
+              <w:t>index</w:t>
+            </w:r>
+            <w:proofErr w:type="spellEnd"/>
+            <w:r>
+              <w:rPr>
+                <w:b/>
+                <w:sz w:val="20"/>
+                <w:lang w:val="en-US"/>
+              </w:rPr>
+              <w:t xml:space="preserve"> }</w:t>
+            </w:r>
+            <w:proofErr w:type="gramEnd"/>
+            <w:r>
+              <w:rPr>
+                <w:b/>
+                <w:sz w:val="20"/>
+                <w:lang w:val="en-US"/>
+              </w:rPr>
+              <w:t xml:space="preserve">}. </w:t>
+            </w:r>
+            <w:proofErr w:type="gramStart"/>
+            <w:r>
+              <w:rPr>
+                <w:b/>
+                <w:sz w:val="20"/>
+                <w:lang w:val="en-US"/>
+              </w:rPr>
+              <w:t xml:space="preserve">{{ </w:t>
+            </w:r>
+            <w:proofErr w:type="spellStart"/>
+            <w:r>
+              <w:rPr>
+                <w:b/>
+                <w:sz w:val="20"/>
+                <w:lang w:val="en-US"/>
+              </w:rPr>
+              <w:t>item</w:t>
+            </w:r>
+            <w:proofErr w:type="gramEnd"/>
+            <w:r>
+              <w:rPr>
+                <w:b/>
+                <w:sz w:val="20"/>
+                <w:lang w:val="en-US"/>
+              </w:rPr>
+              <w:t>.competence</w:t>
+            </w:r>
+            <w:proofErr w:type="spellEnd"/>
+            <w:r>
+              <w:rPr>
+                <w:b/>
+                <w:sz w:val="20"/>
+                <w:lang w:val="en-US"/>
+              </w:rPr>
+              <w:t xml:space="preserve"> }}</w:t>
+            </w:r>
+          </w:p>
+        </w:tc>
+      </w:tr>
+      <w:tr>
+        <w:trPr>
+          <w:trHeight w:val="237"/>
+        </w:trPr>
+        <w:tc>
+          <w:tcPr>
+            <w:tcW w:w="5497" w:type="dxa"/>
             <w:gridSpan w:val="5"/>
             <w:shd w:val="clear" w:color="auto" w:fill="FFFFFF" w:themeFill="background1"/>
           </w:tcPr>
@@ -1734,131 +2366,62 @@
               <w:ind w:left="8"/>
               <w:jc w:val="center"/>
               <w:rPr>
-                <w:b/>
+                <w:bCs/>
                 <w:sz w:val="20"/>
                 <w:lang w:val="en-US"/>
               </w:rPr>
             </w:pPr>
+            <w:r>
+              <w:rPr>
+                <w:bCs/>
+                <w:sz w:val="20"/>
+                <w:lang w:val="en-US"/>
+              </w:rPr>
+              <w:t>{%</w:t>
+            </w:r>
+            <w:r>
+              <w:rPr>
+                <w:bCs/>
+                <w:sz w:val="20"/>
+                <w:lang w:val="en-US"/>
+              </w:rPr>
+              <w:t>tr</w:t>
+            </w:r>
+            <w:r>
+              <w:rPr>
+                <w:bCs/>
+                <w:sz w:val="20"/>
+                <w:lang w:val="en-US"/>
+              </w:rPr>
+              <w:t xml:space="preserve"> for disc in </w:t>
+            </w:r>
+            <w:proofErr w:type="spellStart"/>
             <w:proofErr w:type="gramStart"/>
             <w:r>
               <w:rPr>
-                <w:b/>
-                <w:sz w:val="20"/>
-                <w:lang w:val="en-US"/>
-              </w:rPr>
-              <w:t>{{ item</w:t>
+                <w:bCs/>
+                <w:sz w:val="20"/>
+                <w:lang w:val="en-US"/>
+              </w:rPr>
+              <w:t>item.schema</w:t>
             </w:r>
             <w:proofErr w:type="gramEnd"/>
             <w:r>
               <w:rPr>
-                <w:b/>
-                <w:sz w:val="20"/>
-                <w:lang w:val="en-US"/>
-              </w:rPr>
-              <w:t>.competence_</w:t>
-            </w:r>
-            <w:proofErr w:type="gramStart"/>
-            <w:r>
-              <w:rPr>
-                <w:b/>
-                <w:sz w:val="20"/>
-                <w:lang w:val="en-US"/>
-              </w:rPr>
-              <w:t>index }</w:t>
-            </w:r>
-            <w:proofErr w:type="gramEnd"/>
-            <w:r>
-              <w:rPr>
-                <w:b/>
-                <w:sz w:val="20"/>
-                <w:lang w:val="en-US"/>
-              </w:rPr>
-              <w:t xml:space="preserve">}. </w:t>
-            </w:r>
-            <w:proofErr w:type="gramStart"/>
-            <w:r>
-              <w:rPr>
-                <w:b/>
-                <w:sz w:val="20"/>
-                <w:lang w:val="en-US"/>
-              </w:rPr>
-              <w:t>{{ item</w:t>
-            </w:r>
-            <w:proofErr w:type="gramEnd"/>
-            <w:r>
-              <w:rPr>
-                <w:b/>
-                <w:sz w:val="20"/>
-                <w:lang w:val="en-US"/>
-              </w:rPr>
-              <w:t>.competence }}</w:t>
-            </w:r>
-          </w:p>
-        </w:tc>
-      </w:tr>
-      <w:tr>
-        <w:trPr>
-          <w:trHeight w:val="237"/>
-        </w:trPr>
-        <w:tc>
-          <w:tcPr>
-            <w:tcW w:w="6064" w:type="dxa"/>
-            <w:gridSpan w:val="5"/>
-            <w:shd w:val="clear" w:color="auto" w:fill="FFFFFF" w:themeFill="background1"/>
-          </w:tcPr>
-          <w:p>
-            <w:pPr>
-              <w:pStyle w:val="TableParagraph"/>
-              <w:spacing w:line="211" w:lineRule="exact"/>
-              <w:ind w:left="8"/>
-              <w:jc w:val="center"/>
-              <w:rPr>
                 <w:bCs/>
                 <w:sz w:val="20"/>
                 <w:lang w:val="en-US"/>
               </w:rPr>
-            </w:pPr>
+              <w:t>_fragment</w:t>
+            </w:r>
+            <w:proofErr w:type="spellEnd"/>
             <w:r>
               <w:rPr>
                 <w:bCs/>
                 <w:sz w:val="20"/>
                 <w:lang w:val="en-US"/>
               </w:rPr>
-              <w:t>{%</w:t>
-            </w:r>
-            <w:r>
-              <w:rPr>
-                <w:bCs/>
-                <w:sz w:val="20"/>
-                <w:lang w:val="en-US"/>
-              </w:rPr>
-              <w:t>tr</w:t>
-            </w:r>
-            <w:r>
-              <w:rPr>
-                <w:bCs/>
-                <w:sz w:val="20"/>
-                <w:lang w:val="en-US"/>
-              </w:rPr>
-              <w:t xml:space="preserve"> for disc in </w:t>
-            </w:r>
-            <w:proofErr w:type="gramStart"/>
-            <w:r>
-              <w:rPr>
-                <w:bCs/>
-                <w:sz w:val="20"/>
-                <w:lang w:val="en-US"/>
-              </w:rPr>
-              <w:t>item.schema</w:t>
-            </w:r>
-            <w:proofErr w:type="gramEnd"/>
-            <w:r>
-              <w:rPr>
-                <w:bCs/>
-                <w:sz w:val="20"/>
-                <w:lang w:val="en-US"/>
-              </w:rPr>
-              <w:t>_fragment %}</w:t>
+              <w:t xml:space="preserve"> %}</w:t>
             </w:r>
           </w:p>
         </w:tc>
@@ -1869,14 +2432,14 @@
         </w:trPr>
         <w:tc>
           <w:tcPr>
-            <w:tcW w:w="1714" w:type="dxa"/>
+            <w:tcW w:w="1387" w:type="dxa"/>
             <w:shd w:val="clear" w:color="auto" w:fill="FFFFFF" w:themeFill="background1"/>
             <w:vAlign w:val="center"/>
           </w:tcPr>
           <w:p>
             <w:pPr>
               <w:pStyle w:val="TableParagraph"/>
-              <w:ind w:left="66"/>
+              <w:ind w:left="66" w:right="130"/>
               <w:rPr>
                 <w:sz w:val="20"/>
               </w:rPr>
@@ -1887,7 +2450,15 @@
                 <w:spacing w:val="-2"/>
                 <w:sz w:val="20"/>
               </w:rPr>
-              <w:t>{{ disc</w:t>
+              <w:t xml:space="preserve">{{ </w:t>
+            </w:r>
+            <w:proofErr w:type="spellStart"/>
+            <w:r>
+              <w:rPr>
+                <w:spacing w:val="-2"/>
+                <w:sz w:val="20"/>
+              </w:rPr>
+              <w:t>disc</w:t>
             </w:r>
             <w:proofErr w:type="gramEnd"/>
             <w:r>
@@ -1895,13 +2466,21 @@
                 <w:spacing w:val="-2"/>
                 <w:sz w:val="20"/>
               </w:rPr>
-              <w:t>.discipline_index }}</w:t>
+              <w:t>.discipline_index</w:t>
+            </w:r>
+            <w:proofErr w:type="spellEnd"/>
+            <w:r>
+              <w:rPr>
+                <w:spacing w:val="-2"/>
+                <w:sz w:val="20"/>
+              </w:rPr>
+              <w:t xml:space="preserve"> }}</w:t>
             </w:r>
           </w:p>
         </w:tc>
         <w:tc>
           <w:tcPr>
-            <w:tcW w:w="2705" w:type="dxa"/>
+            <w:tcW w:w="1984" w:type="dxa"/>
             <w:shd w:val="clear" w:color="auto" w:fill="FFFFFF" w:themeFill="background1"/>
             <w:vAlign w:val="center"/>
           </w:tcPr>
@@ -1909,7 +2488,7 @@
             <w:pPr>
               <w:pStyle w:val="TableParagraph"/>
               <w:spacing w:line="216" w:lineRule="exact"/>
-              <w:ind w:left="69"/>
+              <w:ind w:left="69" w:right="135"/>
               <w:rPr>
                 <w:sz w:val="20"/>
               </w:rPr>
@@ -1919,20 +2498,34 @@
               <w:rPr>
                 <w:sz w:val="20"/>
               </w:rPr>
-              <w:t>{{ disc</w:t>
+              <w:t xml:space="preserve">{{ </w:t>
+            </w:r>
+            <w:proofErr w:type="spellStart"/>
+            <w:r>
+              <w:rPr>
+                <w:sz w:val="20"/>
+              </w:rPr>
+              <w:t>disc</w:t>
             </w:r>
             <w:proofErr w:type="gramEnd"/>
             <w:r>
               <w:rPr>
                 <w:sz w:val="20"/>
               </w:rPr>
-              <w:t>.discipline_name }}</w:t>
+              <w:t>.discipline_name</w:t>
+            </w:r>
+            <w:proofErr w:type="spellEnd"/>
+            <w:r>
+              <w:rPr>
+                <w:sz w:val="20"/>
+              </w:rPr>
+              <w:t xml:space="preserve"> }}</w:t>
             </w:r>
           </w:p>
         </w:tc>
         <w:tc>
           <w:tcPr>
-            <w:tcW w:w="511" w:type="dxa"/>
+            <w:tcW w:w="709" w:type="dxa"/>
             <w:shd w:val="clear" w:color="auto" w:fill="FFFFFF" w:themeFill="background1"/>
           </w:tcPr>
           <w:p>
@@ -1948,13 +2541,58 @@
               <w:rPr>
                 <w:lang w:val="en-US"/>
               </w:rPr>
-              <w:t>{%- for sem in semester_headers %}</w:t>
+              <w:t>{%</w:t>
+            </w:r>
+            <w:proofErr w:type="spellStart"/>
+            <w:r>
+              <w:rPr>
+                <w:bCs/>
+                <w:spacing w:val="-5"/>
+                <w:sz w:val="20"/>
+                <w:lang w:val="en-US"/>
+              </w:rPr>
+              <w:t>tc</w:t>
+            </w:r>
+            <w:proofErr w:type="spellEnd"/>
+            <w:r>
+              <w:rPr>
+                <w:lang w:val="en-US"/>
+              </w:rPr>
+              <w:t xml:space="preserve"> for </w:t>
+            </w:r>
+            <w:proofErr w:type="spellStart"/>
+            <w:r>
+              <w:rPr>
+                <w:lang w:val="en-US"/>
+              </w:rPr>
+              <w:t>sem</w:t>
+            </w:r>
+            <w:proofErr w:type="spellEnd"/>
+            <w:r>
+              <w:rPr>
+                <w:lang w:val="en-US"/>
+              </w:rPr>
+              <w:t xml:space="preserve"> in </w:t>
+            </w:r>
+            <w:proofErr w:type="spellStart"/>
+            <w:r>
+              <w:rPr>
+                <w:lang w:val="en-US"/>
+              </w:rPr>
+              <w:t>semester_headers</w:t>
+            </w:r>
+            <w:proofErr w:type="spellEnd"/>
+            <w:r>
+              <w:rPr>
+                <w:lang w:val="en-US"/>
+              </w:rPr>
+              <w:t xml:space="preserve"> %}</w:t>
             </w:r>
           </w:p>
         </w:tc>
         <w:tc>
           <w:tcPr>
-            <w:tcW w:w="583" w:type="dxa"/>
+            <w:tcW w:w="709" w:type="dxa"/>
             <w:shd w:val="clear" w:color="auto" w:fill="FFFFFF" w:themeFill="background1"/>
           </w:tcPr>
           <w:p>
@@ -1978,13 +2616,27 @@
               <w:rPr>
                 <w:lang w:val="en-US"/>
               </w:rPr>
-              <w:t>['semester_' + sem|string] }}</w:t>
+              <w:t xml:space="preserve">['semester_' + </w:t>
+            </w:r>
+            <w:proofErr w:type="spellStart"/>
+            <w:r>
+              <w:rPr>
+                <w:lang w:val="en-US"/>
+              </w:rPr>
+              <w:t>sem|string</w:t>
+            </w:r>
+            <w:proofErr w:type="spellEnd"/>
+            <w:r>
+              <w:rPr>
+                <w:lang w:val="en-US"/>
+              </w:rPr>
+              <w:t>] }}</w:t>
             </w:r>
           </w:p>
         </w:tc>
         <w:tc>
           <w:tcPr>
-            <w:tcW w:w="551" w:type="dxa"/>
+            <w:tcW w:w="708" w:type="dxa"/>
             <w:shd w:val="clear" w:color="auto" w:fill="FFFFFF" w:themeFill="background1"/>
           </w:tcPr>
           <w:p>
@@ -1997,7 +2649,28 @@
               </w:rPr>
             </w:pPr>
             <w:r>
-              <w:t>{%- endfor %}</w:t>
+              <w:t>{%</w:t>
+            </w:r>
+            <w:proofErr w:type="spellStart"/>
+            <w:r>
+              <w:rPr>
+                <w:bCs/>
+                <w:spacing w:val="-5"/>
+                <w:sz w:val="20"/>
+              </w:rPr>
+              <w:t>tc</w:t>
+            </w:r>
+            <w:proofErr w:type="spellEnd"/>
+            <w:r>
+              <w:t xml:space="preserve"> </w:t>
+            </w:r>
+            <w:proofErr w:type="spellStart"/>
+            <w:r>
+              <w:t>endfor</w:t>
+            </w:r>
+            <w:proofErr w:type="spellEnd"/>
+            <w:r>
+              <w:t xml:space="preserve"> %}</w:t>
             </w:r>
           </w:p>
         </w:tc>
@@ -2008,7 +2681,7 @@
         </w:trPr>
         <w:tc>
           <w:tcPr>
-            <w:tcW w:w="6064" w:type="dxa"/>
+            <w:tcW w:w="5497" w:type="dxa"/>
             <w:gridSpan w:val="5"/>
             <w:shd w:val="clear" w:color="auto" w:fill="FFFFFF" w:themeFill="background1"/>
           </w:tcPr>
@@ -2024,7 +2697,35 @@
               <w:rPr>
                 <w:sz w:val="20"/>
               </w:rPr>
-              <w:t>{%tr endfor %</w:t>
+              <w:t>{%</w:t>
+            </w:r>
+            <w:proofErr w:type="spellStart"/>
+            <w:r>
+              <w:rPr>
+                <w:sz w:val="20"/>
+              </w:rPr>
+              <w:t>tr</w:t>
+            </w:r>
+            <w:proofErr w:type="spellEnd"/>
+            <w:r>
+              <w:rPr>
+                <w:sz w:val="20"/>
+              </w:rPr>
+              <w:t xml:space="preserve"> </w:t>
+            </w:r>
+            <w:proofErr w:type="spellStart"/>
+            <w:r>
+              <w:rPr>
+                <w:sz w:val="20"/>
+              </w:rPr>
+              <w:t>endfor</w:t>
+            </w:r>
+            <w:proofErr w:type="spellEnd"/>
+            <w:r>
+              <w:rPr>
+                <w:sz w:val="20"/>
+              </w:rPr>
+              <w:t xml:space="preserve"> %</w:t>
             </w:r>
             <w:r>
               <w:rPr>
@@ -2226,12 +2927,13 @@
         <w:tc>
           <w:tcPr>
             <w:tcW w:w="3740" w:type="dxa"/>
+            <w:vAlign w:val="center"/>
           </w:tcPr>
           <w:p>
             <w:pPr>
               <w:pStyle w:val="TableParagraph"/>
               <w:spacing w:line="230" w:lineRule="atLeast"/>
-              <w:ind w:left="66" w:right="10"/>
+              <w:ind w:left="66" w:right="72"/>
               <w:rPr>
                 <w:sz w:val="20"/>
                 <w:lang w:val="en-US"/>
@@ -2243,7 +2945,15 @@
                 <w:sz w:val="20"/>
                 <w:lang w:val="en-US"/>
               </w:rPr>
-              <w:t>{{ item</w:t>
+              <w:t xml:space="preserve">{{ </w:t>
+            </w:r>
+            <w:proofErr w:type="spellStart"/>
+            <w:r>
+              <w:rPr>
+                <w:sz w:val="20"/>
+                <w:lang w:val="en-US"/>
+              </w:rPr>
+              <w:t>item</w:t>
             </w:r>
             <w:proofErr w:type="gramEnd"/>
             <w:r>
@@ -2259,7 +2969,15 @@
                 <w:sz w:val="20"/>
                 <w:lang w:val="en-US"/>
               </w:rPr>
-              <w:t>index }</w:t>
+              <w:t>index</w:t>
+            </w:r>
+            <w:proofErr w:type="spellEnd"/>
+            <w:r>
+              <w:rPr>
+                <w:sz w:val="20"/>
+                <w:lang w:val="en-US"/>
+              </w:rPr>
+              <w:t xml:space="preserve"> }</w:t>
             </w:r>
             <w:proofErr w:type="gramEnd"/>
             <w:r>
@@ -2275,7 +2993,15 @@
                 <w:sz w:val="20"/>
                 <w:lang w:val="en-US"/>
               </w:rPr>
-              <w:t>{{ item</w:t>
+              <w:t xml:space="preserve">{{ </w:t>
+            </w:r>
+            <w:proofErr w:type="spellStart"/>
+            <w:r>
+              <w:rPr>
+                <w:sz w:val="20"/>
+                <w:lang w:val="en-US"/>
+              </w:rPr>
+              <w:t>item</w:t>
             </w:r>
             <w:proofErr w:type="gramEnd"/>
             <w:r>
@@ -2283,7 +3009,15 @@
                 <w:sz w:val="20"/>
                 <w:lang w:val="en-US"/>
               </w:rPr>
-              <w:t>.competence }}</w:t>
+              <w:t>.competence</w:t>
+            </w:r>
+            <w:proofErr w:type="spellEnd"/>
+            <w:r>
+              <w:rPr>
+                <w:sz w:val="20"/>
+                <w:lang w:val="en-US"/>
+              </w:rPr>
+              <w:t xml:space="preserve"> }}</w:t>
             </w:r>
           </w:p>
         </w:tc>
@@ -2295,7 +3029,7 @@
             <w:pPr>
               <w:pStyle w:val="TableParagraph"/>
               <w:spacing w:line="230" w:lineRule="atLeast"/>
-              <w:ind w:left="69" w:right="51"/>
+              <w:ind w:left="69" w:right="148"/>
               <w:jc w:val="both"/>
               <w:rPr>
                 <w:sz w:val="20"/>
@@ -2306,14 +3040,28 @@
               <w:rPr>
                 <w:sz w:val="20"/>
               </w:rPr>
-              <w:t>{{ item</w:t>
+              <w:t xml:space="preserve">{{ </w:t>
+            </w:r>
+            <w:proofErr w:type="spellStart"/>
+            <w:r>
+              <w:rPr>
+                <w:sz w:val="20"/>
+              </w:rPr>
+              <w:t>item</w:t>
             </w:r>
             <w:proofErr w:type="gramEnd"/>
             <w:r>
               <w:rPr>
                 <w:sz w:val="20"/>
               </w:rPr>
-              <w:t>.competence_final_indicator }}</w:t>
+              <w:t>.competence_final_indicator</w:t>
+            </w:r>
+            <w:proofErr w:type="spellEnd"/>
+            <w:r>
+              <w:rPr>
+                <w:sz w:val="20"/>
+              </w:rPr>
+              <w:t xml:space="preserve"> }}</w:t>
             </w:r>
           </w:p>
         </w:tc>
@@ -2567,9 +3315,9 @@
                 <w:sz w:val="20"/>
                 <w:lang w:val="en-US"/>
               </w:rPr>
-              <w:t xml:space="preserve">{%tr for ind in </w:t>
-            </w:r>
-            <w:proofErr w:type="gramStart"/>
+              <w:t xml:space="preserve">{%tr for </w:t>
+            </w:r>
+            <w:proofErr w:type="spellStart"/>
             <w:r>
               <w:rPr>
                 <w:bCs/>
@@ -2577,9 +3325,9 @@
                 <w:sz w:val="20"/>
                 <w:lang w:val="en-US"/>
               </w:rPr>
-              <w:t>item.indicator</w:t>
-            </w:r>
-            <w:proofErr w:type="gramEnd"/>
+              <w:t>ind</w:t>
+            </w:r>
+            <w:proofErr w:type="spellEnd"/>
             <w:r>
               <w:rPr>
                 <w:bCs/>
@@ -2587,7 +3335,38 @@
                 <w:sz w:val="20"/>
                 <w:lang w:val="en-US"/>
               </w:rPr>
-              <w:t>_list %}</w:t>
+              <w:t xml:space="preserve"> in </w:t>
+            </w:r>
+            <w:proofErr w:type="spellStart"/>
+            <w:proofErr w:type="gramStart"/>
+            <w:r>
+              <w:rPr>
+                <w:bCs/>
+                <w:spacing w:val="-2"/>
+                <w:sz w:val="20"/>
+                <w:lang w:val="en-US"/>
+              </w:rPr>
+              <w:t>item.indicator</w:t>
+            </w:r>
+            <w:proofErr w:type="gramEnd"/>
+            <w:r>
+              <w:rPr>
+                <w:bCs/>
+                <w:spacing w:val="-2"/>
+                <w:sz w:val="20"/>
+                <w:lang w:val="en-US"/>
+              </w:rPr>
+              <w:t>_list</w:t>
+            </w:r>
+            <w:proofErr w:type="spellEnd"/>
+            <w:r>
+              <w:rPr>
+                <w:bCs/>
+                <w:spacing w:val="-2"/>
+                <w:sz w:val="20"/>
+                <w:lang w:val="en-US"/>
+              </w:rPr>
+              <w:t xml:space="preserve"> %}</w:t>
             </w:r>
           </w:p>
         </w:tc>
@@ -2604,6 +3383,7 @@
           <w:p>
             <w:pPr>
               <w:pStyle w:val="TableParagraph"/>
+              <w:ind w:left="116" w:right="36"/>
               <w:rPr>
                 <w:sz w:val="20"/>
               </w:rPr>
@@ -2615,6 +3395,7 @@
               </w:rPr>
               <w:t xml:space="preserve">{{ </w:t>
             </w:r>
+            <w:proofErr w:type="spellStart"/>
             <w:r>
               <w:rPr>
                 <w:bCs/>
@@ -2624,12 +3405,27 @@
               </w:rPr>
               <w:t>ind</w:t>
             </w:r>
+            <w:proofErr w:type="spellEnd"/>
             <w:proofErr w:type="gramEnd"/>
             <w:r>
               <w:rPr>
                 <w:sz w:val="20"/>
               </w:rPr>
-              <w:t>.indicator_index }}</w:t>
+              <w:t>.</w:t>
+            </w:r>
+            <w:proofErr w:type="spellStart"/>
+            <w:r>
+              <w:rPr>
+                <w:sz w:val="20"/>
+              </w:rPr>
+              <w:t>indicator_index</w:t>
+            </w:r>
+            <w:proofErr w:type="spellEnd"/>
+            <w:r>
+              <w:rPr>
+                <w:sz w:val="20"/>
+              </w:rPr>
+              <w:t xml:space="preserve"> }}</w:t>
             </w:r>
           </w:p>
         </w:tc>
@@ -2642,7 +3438,7 @@
             <w:pPr>
               <w:pStyle w:val="TableParagraph"/>
               <w:spacing w:line="216" w:lineRule="exact"/>
-              <w:ind w:left="69"/>
+              <w:ind w:left="69" w:right="66"/>
               <w:jc w:val="both"/>
               <w:rPr>
                 <w:sz w:val="20"/>
@@ -2654,7 +3450,15 @@
                 <w:spacing w:val="-2"/>
                 <w:sz w:val="20"/>
               </w:rPr>
-              <w:t>{{ ind</w:t>
+              <w:t xml:space="preserve">{{ </w:t>
+            </w:r>
+            <w:proofErr w:type="spellStart"/>
+            <w:r>
+              <w:rPr>
+                <w:spacing w:val="-2"/>
+                <w:sz w:val="20"/>
+              </w:rPr>
+              <w:t>ind</w:t>
             </w:r>
             <w:proofErr w:type="gramEnd"/>
             <w:r>
@@ -2662,7 +3466,15 @@
                 <w:spacing w:val="-2"/>
                 <w:sz w:val="20"/>
               </w:rPr>
-              <w:t>.indicator }}</w:t>
+              <w:t>.indicator</w:t>
+            </w:r>
+            <w:proofErr w:type="spellEnd"/>
+            <w:r>
+              <w:rPr>
+                <w:spacing w:val="-2"/>
+                <w:sz w:val="20"/>
+              </w:rPr>
+              <w:t xml:space="preserve"> }}</w:t>
             </w:r>
           </w:p>
         </w:tc>
@@ -2674,7 +3486,7 @@
           <w:p>
             <w:pPr>
               <w:pStyle w:val="TableParagraph"/>
-              <w:ind w:left="66"/>
+              <w:ind w:left="66" w:right="6"/>
               <w:jc w:val="both"/>
               <w:rPr>
                 <w:sz w:val="20"/>
@@ -2686,7 +3498,15 @@
                 <w:spacing w:val="-2"/>
                 <w:sz w:val="20"/>
               </w:rPr>
-              <w:t>{{ ind</w:t>
+              <w:t xml:space="preserve">{{ </w:t>
+            </w:r>
+            <w:proofErr w:type="spellStart"/>
+            <w:r>
+              <w:rPr>
+                <w:spacing w:val="-2"/>
+                <w:sz w:val="20"/>
+              </w:rPr>
+              <w:t>ind</w:t>
             </w:r>
             <w:proofErr w:type="gramEnd"/>
             <w:r>
@@ -2694,7 +3514,15 @@
                 <w:spacing w:val="-2"/>
                 <w:sz w:val="20"/>
               </w:rPr>
-              <w:t>.discipline_name }}</w:t>
+              <w:t>.discipline_name</w:t>
+            </w:r>
+            <w:proofErr w:type="spellEnd"/>
+            <w:r>
+              <w:rPr>
+                <w:spacing w:val="-2"/>
+                <w:sz w:val="20"/>
+              </w:rPr>
+              <w:t xml:space="preserve"> }}</w:t>
             </w:r>
           </w:p>
         </w:tc>
@@ -2723,7 +3551,35 @@
               <w:rPr>
                 <w:sz w:val="20"/>
               </w:rPr>
-              <w:t>{%tr endfor %</w:t>
+              <w:t>{%</w:t>
+            </w:r>
+            <w:proofErr w:type="spellStart"/>
+            <w:r>
+              <w:rPr>
+                <w:sz w:val="20"/>
+              </w:rPr>
+              <w:t>tr</w:t>
+            </w:r>
+            <w:proofErr w:type="spellEnd"/>
+            <w:r>
+              <w:rPr>
+                <w:sz w:val="20"/>
+              </w:rPr>
+              <w:t xml:space="preserve"> </w:t>
+            </w:r>
+            <w:proofErr w:type="spellStart"/>
+            <w:r>
+              <w:rPr>
+                <w:sz w:val="20"/>
+              </w:rPr>
+              <w:t>endfor</w:t>
+            </w:r>
+            <w:proofErr w:type="spellEnd"/>
+            <w:r>
+              <w:rPr>
+                <w:sz w:val="20"/>
+              </w:rPr>
+              <w:t xml:space="preserve"> %</w:t>
             </w:r>
             <w:r>
               <w:rPr>
@@ -2749,7 +3605,7 @@
     <w:tbl>
       <w:tblPr>
         <w:tblStyle w:val="TableNormal"/>
-        <w:tblW w:w="9325" w:type="dxa"/>
+        <w:tblW w:w="7340" w:type="dxa"/>
         <w:tblInd w:w="165" w:type="dxa"/>
         <w:tblBorders>
           <w:top w:val="single" w:sz="6" w:space="0" w:color="000000"/>
@@ -2764,19 +3620,21 @@
         <w:tblLook w:val="01E0" w:firstRow="1" w:lastRow="1" w:firstColumn="1" w:lastColumn="1" w:noHBand="0" w:noVBand="0"/>
       </w:tblPr>
       <w:tblGrid>
-        <w:gridCol w:w="1528"/>
-        <w:gridCol w:w="4253"/>
-        <w:gridCol w:w="1417"/>
+        <w:gridCol w:w="1812"/>
+        <w:gridCol w:w="2268"/>
         <w:gridCol w:w="992"/>
-        <w:gridCol w:w="1135"/>
+        <w:gridCol w:w="1134"/>
+        <w:gridCol w:w="1134"/>
       </w:tblGrid>
       <w:tr>
         <w:trPr>
           <w:trHeight w:val="319"/>
+          <w:tblHeader/>
         </w:trPr>
         <w:tc>
           <w:tcPr>
-            <w:tcW w:w="1528" w:type="dxa"/>
+            <w:tcW w:w="1812" w:type="dxa"/>
+            <w:vMerge w:val="restart"/>
             <w:shd w:val="clear" w:color="auto" w:fill="FFFFFF" w:themeFill="background1"/>
           </w:tcPr>
           <w:p>
@@ -2796,6 +3654,7 @@
                 <w:spacing w:val="-5"/>
                 <w:sz w:val="20"/>
               </w:rPr>
+              <w:lastRenderedPageBreak/>
               <w:t>Код</w:t>
             </w:r>
           </w:p>
@@ -2807,6 +3666,7 @@
               <w:jc w:val="center"/>
               <w:rPr>
                 <w:b/>
+                <w:spacing w:val="-5"/>
                 <w:sz w:val="20"/>
               </w:rPr>
             </w:pPr>
@@ -2822,9 +3682,10 @@
         </w:tc>
         <w:tc>
           <w:tcPr>
-            <w:tcW w:w="4253" w:type="dxa"/>
+            <w:tcW w:w="2268" w:type="dxa"/>
+            <w:vMerge w:val="restart"/>
             <w:tcBorders>
-              <w:tr2bl w:val="single" w:sz="4" w:space="0" w:color="auto"/>
+              <w:tr2bl w:val="nil"/>
             </w:tcBorders>
             <w:shd w:val="clear" w:color="auto" w:fill="FFFFFF" w:themeFill="background1"/>
           </w:tcPr>
@@ -2832,6 +3693,7 @@
             <w:pPr>
               <w:pStyle w:val="TableParagraph"/>
               <w:ind w:left="17" w:right="1"/>
+              <w:jc w:val="center"/>
               <w:rPr>
                 <w:b/>
                 <w:sz w:val="20"/>
@@ -2851,6 +3713,7 @@
               <w:pStyle w:val="TableParagraph"/>
               <w:spacing w:line="210" w:lineRule="exact"/>
               <w:ind w:left="17"/>
+              <w:jc w:val="center"/>
               <w:rPr>
                 <w:b/>
                 <w:spacing w:val="-2"/>
@@ -2866,125 +3729,209 @@
               <w:t>практики</w:t>
             </w:r>
           </w:p>
+        </w:tc>
+        <w:tc>
+          <w:tcPr>
+            <w:tcW w:w="3260" w:type="dxa"/>
+            <w:gridSpan w:val="3"/>
+            <w:vAlign w:val="center"/>
+          </w:tcPr>
+          <w:p>
+            <w:pPr>
+              <w:pStyle w:val="TableParagraph"/>
+              <w:ind w:left="22" w:right="4"/>
+              <w:jc w:val="center"/>
+              <w:rPr>
+                <w:b/>
+                <w:spacing w:val="-5"/>
+                <w:sz w:val="20"/>
+                <w:lang w:val="en-US"/>
+              </w:rPr>
+            </w:pPr>
+            <w:r>
+              <w:rPr>
+                <w:sz w:val="24"/>
+                <w:szCs w:val="24"/>
+                <w:lang w:val="en-US"/>
+              </w:rPr>
+              <w:t xml:space="preserve">{% </w:t>
+            </w:r>
+            <w:proofErr w:type="spellStart"/>
+            <w:r>
+              <w:rPr>
+                <w:sz w:val="24"/>
+                <w:szCs w:val="24"/>
+                <w:lang w:val="en-US"/>
+              </w:rPr>
+              <w:t>colspan</w:t>
+            </w:r>
+            <w:proofErr w:type="spellEnd"/>
+            <w:r>
+              <w:rPr>
+                <w:sz w:val="24"/>
+                <w:szCs w:val="24"/>
+                <w:lang w:val="en-US"/>
+              </w:rPr>
+              <w:t xml:space="preserve"> </w:t>
+            </w:r>
+            <w:proofErr w:type="spellStart"/>
+            <w:proofErr w:type="gramStart"/>
+            <w:r>
+              <w:rPr>
+                <w:b/>
+                <w:spacing w:val="-5"/>
+                <w:sz w:val="20"/>
+                <w:lang w:val="en-US"/>
+              </w:rPr>
+              <w:t>item.indicator</w:t>
+            </w:r>
+            <w:proofErr w:type="gramEnd"/>
+            <w:r>
+              <w:rPr>
+                <w:b/>
+                <w:spacing w:val="-5"/>
+                <w:sz w:val="20"/>
+                <w:lang w:val="en-US"/>
+              </w:rPr>
+              <w:t>_</w:t>
+            </w:r>
+            <w:proofErr w:type="gramStart"/>
+            <w:r>
+              <w:rPr>
+                <w:b/>
+                <w:spacing w:val="-5"/>
+                <w:sz w:val="20"/>
+                <w:lang w:val="en-US"/>
+              </w:rPr>
+              <w:t>distribution.indicator</w:t>
+            </w:r>
+            <w:proofErr w:type="gramEnd"/>
+            <w:r>
+              <w:rPr>
+                <w:b/>
+                <w:spacing w:val="-5"/>
+                <w:sz w:val="20"/>
+                <w:lang w:val="en-US"/>
+              </w:rPr>
+              <w:t>_headers</w:t>
+            </w:r>
+            <w:r>
+              <w:rPr>
+                <w:spacing w:val="-5"/>
+                <w:sz w:val="20"/>
+                <w:lang w:val="en-US"/>
+              </w:rPr>
+              <w:t>|</w:t>
+            </w:r>
+            <w:r>
+              <w:rPr>
+                <w:spacing w:val="-5"/>
+                <w:sz w:val="20"/>
+                <w:lang w:val="en-US"/>
+              </w:rPr>
+              <w:t>count</w:t>
+            </w:r>
+            <w:proofErr w:type="spellEnd"/>
+            <w:r>
+              <w:rPr>
+                <w:sz w:val="24"/>
+                <w:szCs w:val="24"/>
+                <w:lang w:val="en-US"/>
+              </w:rPr>
+              <w:t xml:space="preserve"> </w:t>
+            </w:r>
+            <w:proofErr w:type="gramStart"/>
+            <w:r>
+              <w:rPr>
+                <w:sz w:val="24"/>
+                <w:szCs w:val="24"/>
+                <w:lang w:val="en-US"/>
+              </w:rPr>
+              <w:t>%}</w:t>
+            </w:r>
+            <w:r>
+              <w:rPr>
+                <w:b/>
+                <w:sz w:val="20"/>
+              </w:rPr>
+              <w:t>Код</w:t>
+            </w:r>
+            <w:proofErr w:type="gramEnd"/>
+            <w:r>
+              <w:rPr>
+                <w:b/>
+                <w:spacing w:val="-4"/>
+                <w:sz w:val="20"/>
+                <w:lang w:val="en-US"/>
+              </w:rPr>
+              <w:t xml:space="preserve"> </w:t>
+            </w:r>
+            <w:r>
+              <w:rPr>
+                <w:b/>
+                <w:spacing w:val="-2"/>
+                <w:sz w:val="20"/>
+              </w:rPr>
+              <w:t>индикатора</w:t>
+            </w:r>
+            <w:r>
+              <w:rPr>
+                <w:b/>
+                <w:spacing w:val="-2"/>
+                <w:sz w:val="20"/>
+                <w:lang w:val="en-US"/>
+              </w:rPr>
+              <w:t xml:space="preserve">   </w:t>
+            </w:r>
+          </w:p>
+        </w:tc>
+      </w:tr>
+      <w:tr>
+        <w:trPr>
+          <w:trHeight w:val="319"/>
+          <w:tblHeader/>
+        </w:trPr>
+        <w:tc>
+          <w:tcPr>
+            <w:tcW w:w="1812" w:type="dxa"/>
+            <w:vMerge/>
+            <w:shd w:val="clear" w:color="auto" w:fill="FFFFFF" w:themeFill="background1"/>
+          </w:tcPr>
+          <w:p>
+            <w:pPr>
+              <w:pStyle w:val="TableParagraph"/>
+              <w:spacing w:line="229" w:lineRule="exact"/>
+              <w:ind w:left="13"/>
+              <w:jc w:val="center"/>
+              <w:rPr>
+                <w:b/>
+                <w:sz w:val="20"/>
+                <w:lang w:val="en-US"/>
+              </w:rPr>
+            </w:pPr>
+          </w:p>
+        </w:tc>
+        <w:tc>
+          <w:tcPr>
+            <w:tcW w:w="2268" w:type="dxa"/>
+            <w:vMerge/>
+            <w:tcBorders>
+              <w:tr2bl w:val="nil"/>
+            </w:tcBorders>
+            <w:shd w:val="clear" w:color="auto" w:fill="FFFFFF" w:themeFill="background1"/>
+          </w:tcPr>
           <w:p>
             <w:pPr>
               <w:pStyle w:val="TableParagraph"/>
               <w:spacing w:line="210" w:lineRule="exact"/>
               <w:ind w:left="17"/>
-              <w:jc w:val="right"/>
-              <w:rPr>
-                <w:b/>
-                <w:sz w:val="20"/>
+              <w:jc w:val="center"/>
+              <w:rPr>
+                <w:b/>
+                <w:sz w:val="20"/>
+                <w:lang w:val="en-US"/>
               </w:rPr>
             </w:pPr>
-            <w:r>
-              <w:rPr>
-                <w:b/>
-                <w:sz w:val="20"/>
-              </w:rPr>
-              <w:t>Код</w:t>
-            </w:r>
-            <w:r>
-              <w:rPr>
-                <w:b/>
-                <w:spacing w:val="-4"/>
-                <w:sz w:val="20"/>
-              </w:rPr>
-              <w:t xml:space="preserve"> </w:t>
-            </w:r>
-            <w:r>
-              <w:rPr>
-                <w:b/>
-                <w:spacing w:val="-2"/>
-                <w:sz w:val="20"/>
-              </w:rPr>
-              <w:t xml:space="preserve">индикатора   </w:t>
-            </w:r>
-          </w:p>
-        </w:tc>
-        <w:tc>
-          <w:tcPr>
-            <w:tcW w:w="1417" w:type="dxa"/>
-            <w:vAlign w:val="center"/>
-          </w:tcPr>
-          <w:p>
-            <w:pPr>
-              <w:pStyle w:val="TableParagraph"/>
-              <w:ind w:left="19"/>
-              <w:jc w:val="center"/>
-              <w:rPr>
-                <w:b/>
-                <w:sz w:val="20"/>
-                <w:lang w:val="en-US"/>
-              </w:rPr>
-            </w:pPr>
-            <w:r>
-              <w:rPr>
-                <w:b/>
-                <w:spacing w:val="-5"/>
-                <w:sz w:val="20"/>
-                <w:lang w:val="en-US"/>
-              </w:rPr>
-              <w:t>{%</w:t>
-            </w:r>
-            <w:r>
-              <w:rPr>
-                <w:b/>
-                <w:spacing w:val="-5"/>
-                <w:sz w:val="20"/>
-                <w:lang w:val="en-US"/>
-              </w:rPr>
-              <w:t>-</w:t>
-            </w:r>
-            <w:r>
-              <w:rPr>
-                <w:b/>
-                <w:spacing w:val="-5"/>
-                <w:sz w:val="20"/>
-                <w:lang w:val="en-US"/>
-              </w:rPr>
-              <w:t xml:space="preserve"> for header in </w:t>
-            </w:r>
-            <w:proofErr w:type="gramStart"/>
-            <w:r>
-              <w:rPr>
-                <w:b/>
-                <w:spacing w:val="-5"/>
-                <w:sz w:val="20"/>
-                <w:lang w:val="en-US"/>
-              </w:rPr>
-              <w:t>item.indicator</w:t>
-            </w:r>
-            <w:proofErr w:type="gramEnd"/>
-            <w:r>
-              <w:rPr>
-                <w:b/>
-                <w:spacing w:val="-5"/>
-                <w:sz w:val="20"/>
-                <w:lang w:val="en-US"/>
-              </w:rPr>
-              <w:t>_</w:t>
-            </w:r>
-            <w:proofErr w:type="gramStart"/>
-            <w:r>
-              <w:rPr>
-                <w:b/>
-                <w:spacing w:val="-5"/>
-                <w:sz w:val="20"/>
-                <w:lang w:val="en-US"/>
-              </w:rPr>
-              <w:t>distribution.indicator</w:t>
-            </w:r>
-            <w:proofErr w:type="gramEnd"/>
-            <w:r>
-              <w:rPr>
-                <w:b/>
-                <w:spacing w:val="-5"/>
-                <w:sz w:val="20"/>
-                <w:lang w:val="en-US"/>
-              </w:rPr>
-              <w:t>_headers %}</w:t>
-            </w:r>
           </w:p>
         </w:tc>
         <w:tc>
@@ -3003,14 +3950,45 @@
                 <w:lang w:val="en-US"/>
               </w:rPr>
             </w:pPr>
+            <w:r>
+              <w:rPr>
+                <w:b/>
+                <w:spacing w:val="-5"/>
+                <w:sz w:val="20"/>
+                <w:lang w:val="en-US"/>
+              </w:rPr>
+              <w:t>{%</w:t>
+            </w:r>
+            <w:proofErr w:type="spellStart"/>
+            <w:r>
+              <w:rPr>
+                <w:bCs/>
+                <w:spacing w:val="-5"/>
+                <w:sz w:val="20"/>
+                <w:lang w:val="en-US"/>
+              </w:rPr>
+              <w:t>tc</w:t>
+            </w:r>
+            <w:proofErr w:type="spellEnd"/>
+            <w:r>
+              <w:rPr>
+                <w:b/>
+                <w:spacing w:val="-5"/>
+                <w:sz w:val="20"/>
+                <w:lang w:val="en-US"/>
+              </w:rPr>
+              <w:t xml:space="preserve"> for header in </w:t>
+            </w:r>
+            <w:proofErr w:type="spellStart"/>
             <w:proofErr w:type="gramStart"/>
             <w:r>
               <w:rPr>
                 <w:b/>
                 <w:spacing w:val="-5"/>
                 <w:sz w:val="20"/>
-              </w:rPr>
-              <w:t>{{ header</w:t>
+                <w:lang w:val="en-US"/>
+              </w:rPr>
+              <w:t>item.indicator</w:t>
             </w:r>
             <w:proofErr w:type="gramEnd"/>
             <w:r>
@@ -3018,14 +3996,109 @@
                 <w:b/>
                 <w:spacing w:val="-5"/>
                 <w:sz w:val="20"/>
-              </w:rPr>
-              <w:t xml:space="preserve"> }}</w:t>
+                <w:lang w:val="en-US"/>
+              </w:rPr>
+              <w:t>_</w:t>
+            </w:r>
+            <w:proofErr w:type="gramStart"/>
+            <w:r>
+              <w:rPr>
+                <w:b/>
+                <w:spacing w:val="-5"/>
+                <w:sz w:val="20"/>
+                <w:lang w:val="en-US"/>
+              </w:rPr>
+              <w:t>distribution.indicator</w:t>
+            </w:r>
+            <w:proofErr w:type="gramEnd"/>
+            <w:r>
+              <w:rPr>
+                <w:b/>
+                <w:spacing w:val="-5"/>
+                <w:sz w:val="20"/>
+                <w:lang w:val="en-US"/>
+              </w:rPr>
+              <w:t>_heade</w:t>
+            </w:r>
+            <w:r>
+              <w:rPr>
+                <w:b/>
+                <w:spacing w:val="-5"/>
+                <w:sz w:val="20"/>
+                <w:lang w:val="en-US"/>
+              </w:rPr>
+              <w:t>r</w:t>
+            </w:r>
+            <w:r>
+              <w:rPr>
+                <w:b/>
+                <w:spacing w:val="-5"/>
+                <w:sz w:val="20"/>
+                <w:lang w:val="en-US"/>
+              </w:rPr>
+              <w:t>s</w:t>
+            </w:r>
+            <w:proofErr w:type="spellEnd"/>
+            <w:r>
+              <w:rPr>
+                <w:b/>
+                <w:spacing w:val="-5"/>
+                <w:sz w:val="20"/>
+                <w:lang w:val="en-US"/>
+              </w:rPr>
+              <w:t xml:space="preserve"> %}</w:t>
             </w:r>
           </w:p>
         </w:tc>
         <w:tc>
           <w:tcPr>
-            <w:tcW w:w="1135" w:type="dxa"/>
+            <w:tcW w:w="1134" w:type="dxa"/>
+            <w:vAlign w:val="center"/>
+          </w:tcPr>
+          <w:p>
+            <w:pPr>
+              <w:pStyle w:val="TableParagraph"/>
+              <w:ind w:left="19"/>
+              <w:jc w:val="center"/>
+              <w:rPr>
+                <w:b/>
+                <w:sz w:val="20"/>
+                <w:lang w:val="en-US"/>
+              </w:rPr>
+            </w:pPr>
+            <w:proofErr w:type="gramStart"/>
+            <w:r>
+              <w:rPr>
+                <w:b/>
+                <w:spacing w:val="-5"/>
+                <w:sz w:val="20"/>
+              </w:rPr>
+              <w:t xml:space="preserve">{{ </w:t>
+            </w:r>
+            <w:proofErr w:type="spellStart"/>
+            <w:r>
+              <w:rPr>
+                <w:b/>
+                <w:spacing w:val="-5"/>
+                <w:sz w:val="20"/>
+              </w:rPr>
+              <w:t>header</w:t>
+            </w:r>
+            <w:proofErr w:type="spellEnd"/>
+            <w:proofErr w:type="gramEnd"/>
+            <w:r>
+              <w:rPr>
+                <w:b/>
+                <w:spacing w:val="-5"/>
+                <w:sz w:val="20"/>
+              </w:rPr>
+              <w:t xml:space="preserve"> }}</w:t>
+            </w:r>
+          </w:p>
+        </w:tc>
+        <w:tc>
+          <w:tcPr>
+            <w:tcW w:w="1134" w:type="dxa"/>
             <w:vAlign w:val="center"/>
           </w:tcPr>
           <w:p>
@@ -3047,22 +4120,41 @@
               </w:rPr>
               <w:t>{%</w:t>
             </w:r>
-            <w:r>
-              <w:rPr>
-                <w:b/>
+            <w:proofErr w:type="spellStart"/>
+            <w:r>
+              <w:rPr>
+                <w:bCs/>
                 <w:spacing w:val="-5"/>
                 <w:sz w:val="20"/>
-                <w:lang w:val="en-US"/>
-              </w:rPr>
-              <w:t>-</w:t>
-            </w:r>
+              </w:rPr>
+              <w:t>tc</w:t>
+            </w:r>
+            <w:proofErr w:type="spellEnd"/>
             <w:r>
               <w:rPr>
                 <w:b/>
                 <w:spacing w:val="-5"/>
                 <w:sz w:val="20"/>
               </w:rPr>
-              <w:t xml:space="preserve"> endfor %}</w:t>
+              <w:t xml:space="preserve"> </w:t>
+            </w:r>
+            <w:proofErr w:type="spellStart"/>
+            <w:r>
+              <w:rPr>
+                <w:b/>
+                <w:spacing w:val="-5"/>
+                <w:sz w:val="20"/>
+              </w:rPr>
+              <w:t>endfor</w:t>
+            </w:r>
+            <w:proofErr w:type="spellEnd"/>
+            <w:r>
+              <w:rPr>
+                <w:b/>
+                <w:spacing w:val="-5"/>
+                <w:sz w:val="20"/>
+              </w:rPr>
+              <w:t xml:space="preserve"> %}</w:t>
             </w:r>
           </w:p>
         </w:tc>
@@ -3073,7 +4165,7 @@
         </w:trPr>
         <w:tc>
           <w:tcPr>
-            <w:tcW w:w="9325" w:type="dxa"/>
+            <w:tcW w:w="7340" w:type="dxa"/>
             <w:gridSpan w:val="5"/>
             <w:shd w:val="clear" w:color="auto" w:fill="FFFFFF" w:themeFill="background1"/>
           </w:tcPr>
@@ -3107,6 +4199,7 @@
               </w:rPr>
               <w:t xml:space="preserve"> for disc in </w:t>
             </w:r>
+            <w:proofErr w:type="spellStart"/>
             <w:proofErr w:type="gramStart"/>
             <w:r>
               <w:rPr>
@@ -3131,6 +4224,7 @@
               </w:rPr>
               <w:t>distribution.disciplines</w:t>
             </w:r>
+            <w:proofErr w:type="spellEnd"/>
             <w:proofErr w:type="gramEnd"/>
             <w:r>
               <w:rPr>
@@ -3148,7 +4242,7 @@
         </w:trPr>
         <w:tc>
           <w:tcPr>
-            <w:tcW w:w="1528" w:type="dxa"/>
+            <w:tcW w:w="1812" w:type="dxa"/>
             <w:shd w:val="clear" w:color="auto" w:fill="FFFFFF" w:themeFill="background1"/>
             <w:vAlign w:val="center"/>
           </w:tcPr>
@@ -3168,7 +4262,16 @@
                 <w:sz w:val="20"/>
                 <w:lang w:val="en-US"/>
               </w:rPr>
-              <w:t>{{ disc</w:t>
+              <w:t xml:space="preserve">{{ </w:t>
+            </w:r>
+            <w:proofErr w:type="spellStart"/>
+            <w:r>
+              <w:rPr>
+                <w:spacing w:val="-2"/>
+                <w:sz w:val="20"/>
+                <w:lang w:val="en-US"/>
+              </w:rPr>
+              <w:t>disc</w:t>
             </w:r>
             <w:proofErr w:type="gramEnd"/>
             <w:r>
@@ -3177,13 +4280,22 @@
                 <w:sz w:val="20"/>
                 <w:lang w:val="en-US"/>
               </w:rPr>
-              <w:t>.discipline_index }}</w:t>
+              <w:t>.discipline_index</w:t>
+            </w:r>
+            <w:proofErr w:type="spellEnd"/>
+            <w:r>
+              <w:rPr>
+                <w:spacing w:val="-2"/>
+                <w:sz w:val="20"/>
+                <w:lang w:val="en-US"/>
+              </w:rPr>
+              <w:t xml:space="preserve"> }}</w:t>
             </w:r>
           </w:p>
         </w:tc>
         <w:tc>
           <w:tcPr>
-            <w:tcW w:w="4253" w:type="dxa"/>
+            <w:tcW w:w="2268" w:type="dxa"/>
             <w:shd w:val="clear" w:color="auto" w:fill="FFFFFF" w:themeFill="background1"/>
             <w:vAlign w:val="center"/>
           </w:tcPr>
@@ -3203,7 +4315,15 @@
                 <w:sz w:val="20"/>
                 <w:lang w:val="en-US"/>
               </w:rPr>
-              <w:t>{{ disc</w:t>
+              <w:t xml:space="preserve">{{ </w:t>
+            </w:r>
+            <w:proofErr w:type="spellStart"/>
+            <w:r>
+              <w:rPr>
+                <w:sz w:val="20"/>
+                <w:lang w:val="en-US"/>
+              </w:rPr>
+              <w:t>disc</w:t>
             </w:r>
             <w:proofErr w:type="gramEnd"/>
             <w:r>
@@ -3211,13 +4331,21 @@
                 <w:sz w:val="20"/>
                 <w:lang w:val="en-US"/>
               </w:rPr>
-              <w:t>.discipline_name }}</w:t>
+              <w:t>.discipline_name</w:t>
+            </w:r>
+            <w:proofErr w:type="spellEnd"/>
+            <w:r>
+              <w:rPr>
+                <w:sz w:val="20"/>
+                <w:lang w:val="en-US"/>
+              </w:rPr>
+              <w:t xml:space="preserve"> }}</w:t>
             </w:r>
           </w:p>
         </w:tc>
         <w:tc>
           <w:tcPr>
-            <w:tcW w:w="1417" w:type="dxa"/>
+            <w:tcW w:w="992" w:type="dxa"/>
             <w:vAlign w:val="center"/>
           </w:tcPr>
           <w:p>
@@ -3239,22 +4367,44 @@
               </w:rPr>
               <w:t>{%</w:t>
             </w:r>
+            <w:proofErr w:type="spellStart"/>
+            <w:r>
+              <w:rPr>
+                <w:bCs/>
+                <w:spacing w:val="-5"/>
+                <w:sz w:val="20"/>
+                <w:lang w:val="en-US"/>
+              </w:rPr>
+              <w:t>tc</w:t>
+            </w:r>
+            <w:proofErr w:type="spellEnd"/>
             <w:r>
               <w:rPr>
                 <w:spacing w:val="-10"/>
                 <w:sz w:val="20"/>
                 <w:lang w:val="en-US"/>
               </w:rPr>
-              <w:t>-</w:t>
-            </w:r>
+              <w:t xml:space="preserve"> for </w:t>
+            </w:r>
+            <w:proofErr w:type="spellStart"/>
             <w:r>
               <w:rPr>
                 <w:spacing w:val="-10"/>
                 <w:sz w:val="20"/>
                 <w:lang w:val="en-US"/>
               </w:rPr>
-              <w:t xml:space="preserve"> for val in </w:t>
-            </w:r>
+              <w:t>val</w:t>
+            </w:r>
+            <w:proofErr w:type="spellEnd"/>
+            <w:r>
+              <w:rPr>
+                <w:spacing w:val="-10"/>
+                <w:sz w:val="20"/>
+                <w:lang w:val="en-US"/>
+              </w:rPr>
+              <w:t xml:space="preserve"> in </w:t>
+            </w:r>
+            <w:proofErr w:type="spellStart"/>
             <w:proofErr w:type="gramStart"/>
             <w:r>
               <w:rPr>
@@ -3271,13 +4421,22 @@
                 <w:sz w:val="20"/>
                 <w:lang w:val="en-US"/>
               </w:rPr>
-              <w:t>_row %}</w:t>
+              <w:t>_row</w:t>
+            </w:r>
+            <w:proofErr w:type="spellEnd"/>
+            <w:r>
+              <w:rPr>
+                <w:spacing w:val="-10"/>
+                <w:sz w:val="20"/>
+                <w:lang w:val="en-US"/>
+              </w:rPr>
+              <w:t xml:space="preserve"> %}</w:t>
             </w:r>
           </w:p>
         </w:tc>
         <w:tc>
           <w:tcPr>
-            <w:tcW w:w="992" w:type="dxa"/>
+            <w:tcW w:w="1134" w:type="dxa"/>
             <w:shd w:val="clear" w:color="auto" w:fill="FFFFFF" w:themeFill="background1"/>
             <w:vAlign w:val="center"/>
           </w:tcPr>
@@ -3298,8 +4457,18 @@
                 <w:sz w:val="20"/>
                 <w:lang w:val="en-US"/>
               </w:rPr>
-              <w:t>{{ val</w:t>
-            </w:r>
+              <w:t xml:space="preserve">{{ </w:t>
+            </w:r>
+            <w:proofErr w:type="spellStart"/>
+            <w:r>
+              <w:rPr>
+                <w:spacing w:val="-10"/>
+                <w:sz w:val="20"/>
+                <w:lang w:val="en-US"/>
+              </w:rPr>
+              <w:t>val</w:t>
+            </w:r>
+            <w:proofErr w:type="spellEnd"/>
             <w:proofErr w:type="gramEnd"/>
             <w:r>
               <w:rPr>
@@ -3313,7 +4482,7 @@
         </w:tc>
         <w:tc>
           <w:tcPr>
-            <w:tcW w:w="1135" w:type="dxa"/>
+            <w:tcW w:w="1134" w:type="dxa"/>
             <w:shd w:val="clear" w:color="auto" w:fill="FFFFFF" w:themeFill="background1"/>
             <w:vAlign w:val="center"/>
           </w:tcPr>
@@ -3333,19 +4502,38 @@
               </w:rPr>
               <w:t>{%</w:t>
             </w:r>
-            <w:r>
-              <w:rPr>
-                <w:sz w:val="20"/>
-                <w:lang w:val="en-US"/>
-              </w:rPr>
-              <w:t>-</w:t>
-            </w:r>
-            <w:r>
-              <w:rPr>
-                <w:sz w:val="20"/>
-                <w:lang w:val="en-US"/>
-              </w:rPr>
-              <w:t xml:space="preserve"> endfor %}</w:t>
+            <w:proofErr w:type="spellStart"/>
+            <w:r>
+              <w:rPr>
+                <w:bCs/>
+                <w:spacing w:val="-5"/>
+                <w:sz w:val="20"/>
+              </w:rPr>
+              <w:t>tc</w:t>
+            </w:r>
+            <w:proofErr w:type="spellEnd"/>
+            <w:r>
+              <w:rPr>
+                <w:sz w:val="20"/>
+                <w:lang w:val="en-US"/>
+              </w:rPr>
+              <w:t xml:space="preserve"> </w:t>
+            </w:r>
+            <w:proofErr w:type="spellStart"/>
+            <w:r>
+              <w:rPr>
+                <w:sz w:val="20"/>
+                <w:lang w:val="en-US"/>
+              </w:rPr>
+              <w:t>endfor</w:t>
+            </w:r>
+            <w:proofErr w:type="spellEnd"/>
+            <w:r>
+              <w:rPr>
+                <w:sz w:val="20"/>
+                <w:lang w:val="en-US"/>
+              </w:rPr>
+              <w:t xml:space="preserve"> %}</w:t>
             </w:r>
           </w:p>
         </w:tc>
@@ -3356,7 +4544,7 @@
         </w:trPr>
         <w:tc>
           <w:tcPr>
-            <w:tcW w:w="9325" w:type="dxa"/>
+            <w:tcW w:w="7340" w:type="dxa"/>
             <w:gridSpan w:val="5"/>
             <w:shd w:val="clear" w:color="auto" w:fill="FFFFFF" w:themeFill="background1"/>
           </w:tcPr>
@@ -3373,7 +4561,39 @@
                 <w:spacing w:val="-2"/>
                 <w:sz w:val="20"/>
               </w:rPr>
-              <w:t>{%tr endfor %}</w:t>
+              <w:t>{%</w:t>
+            </w:r>
+            <w:proofErr w:type="spellStart"/>
+            <w:r>
+              <w:rPr>
+                <w:spacing w:val="-2"/>
+                <w:sz w:val="20"/>
+              </w:rPr>
+              <w:t>tr</w:t>
+            </w:r>
+            <w:proofErr w:type="spellEnd"/>
+            <w:r>
+              <w:rPr>
+                <w:spacing w:val="-2"/>
+                <w:sz w:val="20"/>
+              </w:rPr>
+              <w:t xml:space="preserve"> </w:t>
+            </w:r>
+            <w:proofErr w:type="spellStart"/>
+            <w:r>
+              <w:rPr>
+                <w:spacing w:val="-2"/>
+                <w:sz w:val="20"/>
+              </w:rPr>
+              <w:t>endfor</w:t>
+            </w:r>
+            <w:proofErr w:type="spellEnd"/>
+            <w:r>
+              <w:rPr>
+                <w:spacing w:val="-2"/>
+                <w:sz w:val="20"/>
+              </w:rPr>
+              <w:t xml:space="preserve"> %}</w:t>
             </w:r>
           </w:p>
         </w:tc>
@@ -3544,7 +4764,6 @@
                 <w:spacing w:val="-10"/>
                 <w:sz w:val="20"/>
               </w:rPr>
-              <w:lastRenderedPageBreak/>
               <w:t>№</w:t>
             </w:r>
           </w:p>
@@ -3698,8 +4917,27 @@
                 <w:sz w:val="20"/>
                 <w:lang w:val="en-US"/>
               </w:rPr>
-              <w:t xml:space="preserve">{%tr for ind in </w:t>
-            </w:r>
+              <w:t xml:space="preserve">{%tr for </w:t>
+            </w:r>
+            <w:proofErr w:type="spellStart"/>
+            <w:r>
+              <w:rPr>
+                <w:bCs/>
+                <w:sz w:val="20"/>
+                <w:lang w:val="en-US"/>
+              </w:rPr>
+              <w:t>ind</w:t>
+            </w:r>
+            <w:proofErr w:type="spellEnd"/>
+            <w:r>
+              <w:rPr>
+                <w:bCs/>
+                <w:sz w:val="20"/>
+                <w:lang w:val="en-US"/>
+              </w:rPr>
+              <w:t xml:space="preserve"> in </w:t>
+            </w:r>
+            <w:proofErr w:type="spellStart"/>
             <w:proofErr w:type="gramStart"/>
             <w:r>
               <w:rPr>
@@ -3716,7 +4954,16 @@
                 <w:sz w:val="20"/>
                 <w:lang w:val="en-US"/>
               </w:rPr>
-              <w:t>_list %}</w:t>
+              <w:t>_list</w:t>
+            </w:r>
+            <w:proofErr w:type="spellEnd"/>
+            <w:r>
+              <w:rPr>
+                <w:bCs/>
+                <w:sz w:val="20"/>
+                <w:lang w:val="en-US"/>
+              </w:rPr>
+              <w:t xml:space="preserve"> %}</w:t>
             </w:r>
           </w:p>
         </w:tc>
@@ -3745,7 +4992,15 @@
                 <w:spacing w:val="-10"/>
                 <w:sz w:val="20"/>
               </w:rPr>
-              <w:t>{{ loop</w:t>
+              <w:t xml:space="preserve">{{ </w:t>
+            </w:r>
+            <w:proofErr w:type="spellStart"/>
+            <w:r>
+              <w:rPr>
+                <w:spacing w:val="-10"/>
+                <w:sz w:val="20"/>
+              </w:rPr>
+              <w:t>loop</w:t>
             </w:r>
             <w:proofErr w:type="gramEnd"/>
             <w:r>
@@ -3753,7 +5008,15 @@
                 <w:spacing w:val="-10"/>
                 <w:sz w:val="20"/>
               </w:rPr>
-              <w:t>.index }}</w:t>
+              <w:t>.index</w:t>
+            </w:r>
+            <w:proofErr w:type="spellEnd"/>
+            <w:r>
+              <w:rPr>
+                <w:spacing w:val="-10"/>
+                <w:sz w:val="20"/>
+              </w:rPr>
+              <w:t xml:space="preserve"> }}</w:t>
             </w:r>
           </w:p>
         </w:tc>
@@ -3777,14 +5040,28 @@
               <w:rPr>
                 <w:sz w:val="20"/>
               </w:rPr>
-              <w:t>{{ ind</w:t>
+              <w:t xml:space="preserve">{{ </w:t>
+            </w:r>
+            <w:proofErr w:type="spellStart"/>
+            <w:r>
+              <w:rPr>
+                <w:sz w:val="20"/>
+              </w:rPr>
+              <w:t>ind</w:t>
             </w:r>
             <w:proofErr w:type="gramEnd"/>
             <w:r>
               <w:rPr>
                 <w:sz w:val="20"/>
               </w:rPr>
-              <w:t>.discipline_name }}</w:t>
+              <w:t>.discipline_name</w:t>
+            </w:r>
+            <w:proofErr w:type="spellEnd"/>
+            <w:r>
+              <w:rPr>
+                <w:sz w:val="20"/>
+              </w:rPr>
+              <w:t xml:space="preserve"> }}</w:t>
             </w:r>
           </w:p>
         </w:tc>
@@ -3807,14 +5084,28 @@
               <w:rPr>
                 <w:sz w:val="20"/>
               </w:rPr>
-              <w:t>{{ ind</w:t>
+              <w:t xml:space="preserve">{{ </w:t>
+            </w:r>
+            <w:proofErr w:type="spellStart"/>
+            <w:r>
+              <w:rPr>
+                <w:sz w:val="20"/>
+              </w:rPr>
+              <w:t>ind</w:t>
             </w:r>
             <w:proofErr w:type="gramEnd"/>
             <w:r>
               <w:rPr>
                 <w:sz w:val="20"/>
               </w:rPr>
-              <w:t>.indicator_index }}</w:t>
+              <w:t>.indicator_index</w:t>
+            </w:r>
+            <w:proofErr w:type="spellEnd"/>
+            <w:r>
+              <w:rPr>
+                <w:sz w:val="20"/>
+              </w:rPr>
+              <w:t xml:space="preserve"> }}</w:t>
             </w:r>
           </w:p>
         </w:tc>
@@ -3827,6 +5118,7 @@
             <w:pPr>
               <w:pStyle w:val="TableParagraph"/>
               <w:ind w:left="67" w:right="46"/>
+              <w:jc w:val="both"/>
               <w:rPr>
                 <w:sz w:val="20"/>
               </w:rPr>
@@ -3849,8 +5141,16 @@
               <w:rPr>
                 <w:sz w:val="20"/>
               </w:rPr>
-              <w:t>{{ ind</w:t>
-            </w:r>
+              <w:t xml:space="preserve">{{ </w:t>
+            </w:r>
+            <w:proofErr w:type="spellStart"/>
+            <w:r>
+              <w:rPr>
+                <w:sz w:val="20"/>
+              </w:rPr>
+              <w:t>ind</w:t>
+            </w:r>
+            <w:proofErr w:type="spellEnd"/>
             <w:proofErr w:type="gramEnd"/>
             <w:r>
               <w:rPr>
@@ -3884,6 +5184,7 @@
             <w:pPr>
               <w:pStyle w:val="TableParagraph"/>
               <w:ind w:left="67" w:right="52"/>
+              <w:jc w:val="both"/>
               <w:rPr>
                 <w:sz w:val="20"/>
               </w:rPr>
@@ -3906,8 +5207,16 @@
               <w:rPr>
                 <w:sz w:val="20"/>
               </w:rPr>
-              <w:t>{{ ind</w:t>
-            </w:r>
+              <w:t xml:space="preserve">{{ </w:t>
+            </w:r>
+            <w:proofErr w:type="spellStart"/>
+            <w:r>
+              <w:rPr>
+                <w:sz w:val="20"/>
+              </w:rPr>
+              <w:t>ind</w:t>
+            </w:r>
+            <w:proofErr w:type="spellEnd"/>
             <w:proofErr w:type="gramEnd"/>
             <w:r>
               <w:rPr>
@@ -3942,6 +5251,7 @@
               <w:pStyle w:val="TableParagraph"/>
               <w:spacing w:line="230" w:lineRule="exact"/>
               <w:ind w:left="67" w:right="1171"/>
+              <w:jc w:val="both"/>
               <w:rPr>
                 <w:sz w:val="20"/>
               </w:rPr>
@@ -3971,7 +5281,21 @@
               <w:rPr>
                 <w:sz w:val="20"/>
               </w:rPr>
-              <w:t>{{ ind.</w:t>
+              <w:t xml:space="preserve">{{ </w:t>
+            </w:r>
+            <w:proofErr w:type="spellStart"/>
+            <w:r>
+              <w:rPr>
+                <w:sz w:val="20"/>
+              </w:rPr>
+              <w:t>ind</w:t>
+            </w:r>
+            <w:proofErr w:type="spellEnd"/>
+            <w:r>
+              <w:rPr>
+                <w:sz w:val="20"/>
+              </w:rPr>
+              <w:t>.</w:t>
             </w:r>
             <w:r>
               <w:rPr>
@@ -4013,7 +5337,35 @@
               <w:rPr>
                 <w:sz w:val="20"/>
               </w:rPr>
-              <w:t>{%tr endfor %</w:t>
+              <w:t>{%</w:t>
+            </w:r>
+            <w:proofErr w:type="spellStart"/>
+            <w:r>
+              <w:rPr>
+                <w:sz w:val="20"/>
+              </w:rPr>
+              <w:t>tr</w:t>
+            </w:r>
+            <w:proofErr w:type="spellEnd"/>
+            <w:r>
+              <w:rPr>
+                <w:sz w:val="20"/>
+              </w:rPr>
+              <w:t xml:space="preserve"> </w:t>
+            </w:r>
+            <w:proofErr w:type="spellStart"/>
+            <w:r>
+              <w:rPr>
+                <w:sz w:val="20"/>
+              </w:rPr>
+              <w:t>endfor</w:t>
+            </w:r>
+            <w:proofErr w:type="spellEnd"/>
+            <w:r>
+              <w:rPr>
+                <w:sz w:val="20"/>
+              </w:rPr>
+              <w:t xml:space="preserve"> %</w:t>
             </w:r>
             <w:r>
               <w:rPr>
@@ -4356,8 +5708,27 @@
                 <w:sz w:val="20"/>
                 <w:lang w:val="en-US"/>
               </w:rPr>
-              <w:t xml:space="preserve">{%tr for ind in </w:t>
-            </w:r>
+              <w:t xml:space="preserve">{%tr for </w:t>
+            </w:r>
+            <w:proofErr w:type="spellStart"/>
+            <w:r>
+              <w:rPr>
+                <w:bCs/>
+                <w:sz w:val="20"/>
+                <w:lang w:val="en-US"/>
+              </w:rPr>
+              <w:t>ind</w:t>
+            </w:r>
+            <w:proofErr w:type="spellEnd"/>
+            <w:r>
+              <w:rPr>
+                <w:bCs/>
+                <w:sz w:val="20"/>
+                <w:lang w:val="en-US"/>
+              </w:rPr>
+              <w:t xml:space="preserve"> in </w:t>
+            </w:r>
+            <w:proofErr w:type="spellStart"/>
             <w:proofErr w:type="gramStart"/>
             <w:r>
               <w:rPr>
@@ -4374,7 +5745,16 @@
                 <w:sz w:val="20"/>
                 <w:lang w:val="en-US"/>
               </w:rPr>
-              <w:t>_list %}</w:t>
+              <w:t>_list</w:t>
+            </w:r>
+            <w:proofErr w:type="spellEnd"/>
+            <w:r>
+              <w:rPr>
+                <w:bCs/>
+                <w:sz w:val="20"/>
+                <w:lang w:val="en-US"/>
+              </w:rPr>
+              <w:t xml:space="preserve"> %}</w:t>
             </w:r>
           </w:p>
         </w:tc>
@@ -4404,7 +5784,15 @@
                 <w:sz w:val="20"/>
                 <w:lang w:val="en-US"/>
               </w:rPr>
-              <w:t>{{ ind</w:t>
+              <w:t xml:space="preserve">{{ </w:t>
+            </w:r>
+            <w:proofErr w:type="spellStart"/>
+            <w:r>
+              <w:rPr>
+                <w:sz w:val="20"/>
+                <w:lang w:val="en-US"/>
+              </w:rPr>
+              <w:t>ind</w:t>
             </w:r>
             <w:proofErr w:type="gramEnd"/>
             <w:r>
@@ -4420,7 +5808,15 @@
                 <w:sz w:val="20"/>
                 <w:lang w:val="en-US"/>
               </w:rPr>
-              <w:t>index }</w:t>
+              <w:t>index</w:t>
+            </w:r>
+            <w:proofErr w:type="spellEnd"/>
+            <w:r>
+              <w:rPr>
+                <w:sz w:val="20"/>
+                <w:lang w:val="en-US"/>
+              </w:rPr>
+              <w:t xml:space="preserve"> }</w:t>
             </w:r>
             <w:proofErr w:type="gramEnd"/>
             <w:r>
@@ -4444,7 +5840,16 @@
                 <w:sz w:val="20"/>
                 <w:lang w:val="en-US"/>
               </w:rPr>
-              <w:t>{{ ind</w:t>
+              <w:t xml:space="preserve">{{ </w:t>
+            </w:r>
+            <w:proofErr w:type="spellStart"/>
+            <w:r>
+              <w:rPr>
+                <w:spacing w:val="-2"/>
+                <w:sz w:val="20"/>
+                <w:lang w:val="en-US"/>
+              </w:rPr>
+              <w:t>ind</w:t>
             </w:r>
             <w:proofErr w:type="gramEnd"/>
             <w:r>
@@ -4453,7 +5858,16 @@
                 <w:sz w:val="20"/>
                 <w:lang w:val="en-US"/>
               </w:rPr>
-              <w:t>.indicator }}</w:t>
+              <w:t>.indicator</w:t>
+            </w:r>
+            <w:proofErr w:type="spellEnd"/>
+            <w:r>
+              <w:rPr>
+                <w:spacing w:val="-2"/>
+                <w:sz w:val="20"/>
+                <w:lang w:val="en-US"/>
+              </w:rPr>
+              <w:t xml:space="preserve"> }}</w:t>
             </w:r>
           </w:p>
         </w:tc>
@@ -4476,8 +5890,16 @@
               <w:rPr>
                 <w:sz w:val="20"/>
               </w:rPr>
-              <w:t>{{ ind</w:t>
-            </w:r>
+              <w:t xml:space="preserve">{{ </w:t>
+            </w:r>
+            <w:proofErr w:type="spellStart"/>
+            <w:r>
+              <w:rPr>
+                <w:sz w:val="20"/>
+              </w:rPr>
+              <w:t>ind</w:t>
+            </w:r>
+            <w:proofErr w:type="spellEnd"/>
             <w:proofErr w:type="gramEnd"/>
             <w:r>
               <w:rPr>
@@ -4519,8 +5941,16 @@
               <w:rPr>
                 <w:sz w:val="20"/>
               </w:rPr>
-              <w:t>{{ ind</w:t>
-            </w:r>
+              <w:t xml:space="preserve">{{ </w:t>
+            </w:r>
+            <w:proofErr w:type="spellStart"/>
+            <w:r>
+              <w:rPr>
+                <w:sz w:val="20"/>
+              </w:rPr>
+              <w:t>ind</w:t>
+            </w:r>
+            <w:proofErr w:type="spellEnd"/>
             <w:proofErr w:type="gramEnd"/>
             <w:r>
               <w:rPr>
@@ -4566,7 +5996,35 @@
               <w:rPr>
                 <w:sz w:val="20"/>
               </w:rPr>
-              <w:t>{%tr endfor %</w:t>
+              <w:t>{%</w:t>
+            </w:r>
+            <w:proofErr w:type="spellStart"/>
+            <w:r>
+              <w:rPr>
+                <w:sz w:val="20"/>
+              </w:rPr>
+              <w:t>tr</w:t>
+            </w:r>
+            <w:proofErr w:type="spellEnd"/>
+            <w:r>
+              <w:rPr>
+                <w:sz w:val="20"/>
+              </w:rPr>
+              <w:t xml:space="preserve"> </w:t>
+            </w:r>
+            <w:proofErr w:type="spellStart"/>
+            <w:r>
+              <w:rPr>
+                <w:sz w:val="20"/>
+              </w:rPr>
+              <w:t>endfor</w:t>
+            </w:r>
+            <w:proofErr w:type="spellEnd"/>
+            <w:r>
+              <w:rPr>
+                <w:sz w:val="20"/>
+              </w:rPr>
+              <w:t xml:space="preserve"> %</w:t>
             </w:r>
             <w:r>
               <w:rPr>
@@ -4601,7 +6059,21 @@
           <w:lang w:val="en-US"/>
         </w:rPr>
         <w:lastRenderedPageBreak/>
-        <w:t>{% endfor -%}</w:t>
+        <w:t xml:space="preserve">{% </w:t>
+      </w:r>
+      <w:proofErr w:type="spellStart"/>
+      <w:r>
+        <w:rPr>
+          <w:lang w:val="en-US"/>
+        </w:rPr>
+        <w:t>endfor</w:t>
+      </w:r>
+      <w:proofErr w:type="spellEnd"/>
+      <w:r>
+        <w:rPr>
+          <w:lang w:val="en-US"/>
+        </w:rPr>
+        <w:t xml:space="preserve"> -%}</w:t>
       </w:r>
     </w:p>
     <w:sectPr>

</xml_diff>

<commit_message>
corrected to work with the competency model
</commit_message>
<xml_diff>
--- a/templates/docxRPD/passport.docx
+++ b/templates/docxRPD/passport.docx
@@ -5117,7 +5117,7 @@
           <w:p>
             <w:pPr>
               <w:pStyle w:val="TableParagraph"/>
-              <w:ind w:left="67" w:right="46"/>
+              <w:ind w:left="67" w:right="-6"/>
               <w:jc w:val="both"/>
               <w:rPr>
                 <w:sz w:val="20"/>
@@ -5183,7 +5183,7 @@
           <w:p>
             <w:pPr>
               <w:pStyle w:val="TableParagraph"/>
-              <w:ind w:left="67" w:right="52"/>
+              <w:ind w:left="67" w:right="-6"/>
               <w:jc w:val="both"/>
               <w:rPr>
                 <w:sz w:val="20"/>
@@ -5250,7 +5250,7 @@
             <w:pPr>
               <w:pStyle w:val="TableParagraph"/>
               <w:spacing w:line="230" w:lineRule="exact"/>
-              <w:ind w:left="67" w:right="1171"/>
+              <w:ind w:left="67" w:right="-6"/>
               <w:jc w:val="both"/>
               <w:rPr>
                 <w:sz w:val="20"/>
@@ -5930,7 +5930,7 @@
           <w:p>
             <w:pPr>
               <w:pStyle w:val="TableParagraph"/>
-              <w:ind w:left="69" w:right="641"/>
+              <w:ind w:left="69" w:right="6"/>
               <w:jc w:val="both"/>
               <w:rPr>
                 <w:sz w:val="20"/>

</xml_diff>